<commit_message>
game icon made in .png and converted to .ico
</commit_message>
<xml_diff>
--- a/Content/Docs/GDD_Murder_In_Purple.docx
+++ b/Content/Docs/GDD_Murder_In_Purple.docx
@@ -336,13 +336,25 @@
           <w:lang w:val="en-US"/>
         </w:rPr>
       </w:pPr>
-    </w:p>
-    <w:p>
-      <w:pPr>
-        <w:rPr>
-          <w:lang w:val="en-US"/>
-        </w:rPr>
-      </w:pPr>
+      <w:r>
+        <w:rPr>
+          <w:lang w:val="en-US"/>
+        </w:rPr>
+        <w:t>https://free-game-assets.itch.io/free-wild-animal-3d-low-poly-models</w:t>
+      </w:r>
+    </w:p>
+    <w:p>
+      <w:pPr>
+        <w:rPr>
+          <w:lang w:val="en-US"/>
+        </w:rPr>
+      </w:pPr>
+      <w:r>
+        <w:rPr>
+          <w:lang w:val="en-US"/>
+        </w:rPr>
+        <w:t>https://www.syntystudios.com/</w:t>
+      </w:r>
     </w:p>
     <w:p>
       <w:pPr>

</xml_diff>

<commit_message>
added interactable and notes from brainstorming with Jessica
</commit_message>
<xml_diff>
--- a/Content/Docs/GDD_Murder_In_Purple.docx
+++ b/Content/Docs/GDD_Murder_In_Purple.docx
@@ -266,7 +266,7 @@
                     </pic:cNvPicPr>
                   </pic:nvPicPr>
                   <pic:blipFill>
-                    <a:blip r:embed="rId4">
+                    <a:blip r:embed="rId5">
                       <a:extLst>
                         <a:ext uri="{28A0092B-C50C-407E-A947-70E740481C1C}">
                           <a14:useLocalDpi xmlns:a14="http://schemas.microsoft.com/office/drawing/2010/main" val="0"/>
@@ -416,12 +416,431 @@
           <w:lang w:val="en-US"/>
         </w:rPr>
       </w:pPr>
-      <w:r>
-        <w:rPr>
-          <w:lang w:val="en-US"/>
-        </w:rPr>
-        <w:t>https://justis-lee.itch.io/wake-up-the-night</w:t>
-      </w:r>
+      <w:hyperlink r:id="rId6" w:history="1">
+        <w:r>
+          <w:rPr>
+            <w:rStyle w:val="Hyperlink"/>
+            <w:lang w:val="en-US"/>
+          </w:rPr>
+          <w:t>https://justis-lee.itch.io/wake-up-the-night</w:t>
+        </w:r>
+      </w:hyperlink>
+    </w:p>
+    <w:p>
+      <w:pPr>
+        <w:rPr>
+          <w:lang w:val="en-US"/>
+        </w:rPr>
+      </w:pPr>
+    </w:p>
+    <w:p>
+      <w:pPr>
+        <w:rPr>
+          <w:b/>
+          <w:bCs/>
+          <w:lang w:val="en-US"/>
+        </w:rPr>
+      </w:pPr>
+      <w:r>
+        <w:rPr>
+          <w:b/>
+          <w:bCs/>
+          <w:lang w:val="en-US"/>
+        </w:rPr>
+        <w:t>Inspiration Games</w:t>
+      </w:r>
+    </w:p>
+    <w:p>
+      <w:pPr>
+        <w:rPr>
+          <w:lang w:val="en-US"/>
+        </w:rPr>
+      </w:pPr>
+      <w:r>
+        <w:rPr>
+          <w:lang w:val="en-US"/>
+        </w:rPr>
+        <w:t xml:space="preserve">Sherlock Holmes: Crimes and Punishment – Most important </w:t>
+      </w:r>
+      <w:proofErr w:type="gramStart"/>
+      <w:r>
+        <w:rPr>
+          <w:lang w:val="en-US"/>
+        </w:rPr>
+        <w:t>( UI</w:t>
+      </w:r>
+      <w:proofErr w:type="gramEnd"/>
+      <w:r>
+        <w:rPr>
+          <w:lang w:val="en-US"/>
+        </w:rPr>
+        <w:t xml:space="preserve"> for investigation, except for weird word addition)</w:t>
+      </w:r>
+    </w:p>
+    <w:p>
+      <w:pPr>
+        <w:rPr>
+          <w:lang w:val="en-US"/>
+        </w:rPr>
+      </w:pPr>
+    </w:p>
+    <w:p>
+      <w:pPr>
+        <w:rPr>
+          <w:lang w:val="en-US"/>
+        </w:rPr>
+      </w:pPr>
+      <w:r>
+        <w:rPr>
+          <w:lang w:val="en-US"/>
+        </w:rPr>
+        <w:t>Obra Din</w:t>
+      </w:r>
+      <w:r>
+        <w:rPr>
+          <w:lang w:val="en-US"/>
+        </w:rPr>
+        <w:t>n</w:t>
+      </w:r>
+    </w:p>
+    <w:p>
+      <w:pPr>
+        <w:rPr>
+          <w:lang w:val="en-US"/>
+        </w:rPr>
+      </w:pPr>
+      <w:r>
+        <w:rPr>
+          <w:lang w:val="en-US"/>
+        </w:rPr>
+        <w:t>Golden Idol</w:t>
+      </w:r>
+      <w:r>
+        <w:rPr>
+          <w:lang w:val="en-US"/>
+        </w:rPr>
+        <w:t xml:space="preserve"> </w:t>
+      </w:r>
+      <w:proofErr w:type="gramStart"/>
+      <w:r>
+        <w:rPr>
+          <w:lang w:val="en-US"/>
+        </w:rPr>
+        <w:t>( UI</w:t>
+      </w:r>
+      <w:proofErr w:type="gramEnd"/>
+      <w:r>
+        <w:rPr>
+          <w:lang w:val="en-US"/>
+        </w:rPr>
+        <w:t xml:space="preserve"> for investigation)</w:t>
+      </w:r>
+    </w:p>
+    <w:p>
+      <w:pPr>
+        <w:rPr>
+          <w:lang w:val="en-US"/>
+        </w:rPr>
+      </w:pPr>
+      <w:r>
+        <w:rPr>
+          <w:lang w:val="en-US"/>
+        </w:rPr>
+        <w:t>Forgotten City</w:t>
+      </w:r>
+    </w:p>
+    <w:p>
+      <w:pPr>
+        <w:rPr>
+          <w:lang w:val="en-US"/>
+        </w:rPr>
+      </w:pPr>
+    </w:p>
+    <w:p>
+      <w:pPr>
+        <w:pStyle w:val="ListParagraph"/>
+        <w:numPr>
+          <w:ilvl w:val="0"/>
+          <w:numId w:val="1"/>
+        </w:numPr>
+        <w:rPr>
+          <w:lang w:val="en-US"/>
+        </w:rPr>
+      </w:pPr>
+    </w:p>
+    <w:p>
+      <w:pPr>
+        <w:rPr>
+          <w:lang w:val="en-US"/>
+        </w:rPr>
+      </w:pPr>
+    </w:p>
+    <w:p>
+      <w:pPr>
+        <w:rPr>
+          <w:b/>
+          <w:bCs/>
+          <w:lang w:val="en-US"/>
+        </w:rPr>
+      </w:pPr>
+      <w:r>
+        <w:rPr>
+          <w:b/>
+          <w:bCs/>
+          <w:lang w:val="en-US"/>
+        </w:rPr>
+        <w:lastRenderedPageBreak/>
+        <w:t>Story</w:t>
+      </w:r>
+    </w:p>
+    <w:p>
+      <w:r>
+        <w:rPr>
+          <w:lang w:val="en-US"/>
+        </w:rPr>
+        <w:t xml:space="preserve">The main character is either a </w:t>
+      </w:r>
+      <w:proofErr w:type="spellStart"/>
+      <w:r>
+        <w:t>Praefectus</w:t>
+      </w:r>
+      <w:proofErr w:type="spellEnd"/>
+      <w:r>
+        <w:t xml:space="preserve"> Urbi</w:t>
+      </w:r>
+      <w:r>
+        <w:t xml:space="preserve"> or their servant/slave. He will be charged with investigating what’s happening in the island. </w:t>
+      </w:r>
+      <w:r>
+        <w:t>The</w:t>
+      </w:r>
+      <w:r>
+        <w:t xml:space="preserve"> slave can read so he works as a secretary for the </w:t>
+      </w:r>
+      <w:proofErr w:type="spellStart"/>
+      <w:r>
+        <w:t>Praefectus</w:t>
+      </w:r>
+      <w:proofErr w:type="spellEnd"/>
+      <w:r>
+        <w:t>. The motivation of the player as the Slave is to become a freeman. The slave is in love with the other Slave and is motivated to become free but is kept loyal because he wants to keep his relationship with the other slave.</w:t>
+      </w:r>
+    </w:p>
+    <w:p/>
+    <w:p>
+      <w:pPr>
+        <w:rPr>
+          <w:b/>
+          <w:bCs/>
+        </w:rPr>
+      </w:pPr>
+      <w:r>
+        <w:rPr>
+          <w:b/>
+          <w:bCs/>
+        </w:rPr>
+        <w:t>Characters</w:t>
+      </w:r>
+    </w:p>
+    <w:p>
+      <w:proofErr w:type="spellStart"/>
+      <w:r>
+        <w:t>Praefectus</w:t>
+      </w:r>
+      <w:proofErr w:type="spellEnd"/>
+      <w:r>
+        <w:t xml:space="preserve"> Urbi</w:t>
+      </w:r>
+    </w:p>
+    <w:p>
+      <w:r>
+        <w:t xml:space="preserve">Slave – </w:t>
+      </w:r>
+      <w:r>
+        <w:t>Primus</w:t>
+      </w:r>
+      <w:r>
+        <w:t xml:space="preserve"> (slave nickname)</w:t>
+      </w:r>
+    </w:p>
+    <w:p>
+      <w:r>
+        <w:t>Diana</w:t>
+      </w:r>
+    </w:p>
+    <w:p/>
+    <w:p>
+      <w:pPr>
+        <w:rPr>
+          <w:b/>
+          <w:bCs/>
+        </w:rPr>
+      </w:pPr>
+      <w:r>
+        <w:rPr>
+          <w:b/>
+          <w:bCs/>
+        </w:rPr>
+        <w:t>Core Gameplay Mechanics</w:t>
+      </w:r>
+    </w:p>
+    <w:p>
+      <w:pPr>
+        <w:rPr>
+          <w:b/>
+          <w:bCs/>
+        </w:rPr>
+      </w:pPr>
+    </w:p>
+    <w:p>
+      <w:pPr>
+        <w:rPr>
+          <w:b/>
+          <w:bCs/>
+        </w:rPr>
+      </w:pPr>
+    </w:p>
+    <w:p/>
+    <w:p>
+      <w:pPr>
+        <w:rPr>
+          <w:b/>
+          <w:bCs/>
+        </w:rPr>
+      </w:pPr>
+      <w:r>
+        <w:rPr>
+          <w:b/>
+          <w:bCs/>
+        </w:rPr>
+        <w:t xml:space="preserve">Dreams For </w:t>
+      </w:r>
+      <w:r>
+        <w:rPr>
+          <w:b/>
+          <w:bCs/>
+        </w:rPr>
+        <w:t>the</w:t>
+      </w:r>
+      <w:r>
+        <w:rPr>
+          <w:b/>
+          <w:bCs/>
+        </w:rPr>
+        <w:t xml:space="preserve"> Game</w:t>
+      </w:r>
+    </w:p>
+    <w:p>
+      <w:r>
+        <w:t>Character Selection</w:t>
+      </w:r>
+    </w:p>
+    <w:p>
+      <w:pPr>
+        <w:pStyle w:val="ListParagraph"/>
+        <w:numPr>
+          <w:ilvl w:val="0"/>
+          <w:numId w:val="1"/>
+        </w:numPr>
+      </w:pPr>
+      <w:proofErr w:type="spellStart"/>
+      <w:r>
+        <w:t>Praefectus</w:t>
+      </w:r>
+      <w:proofErr w:type="spellEnd"/>
+    </w:p>
+    <w:p>
+      <w:pPr>
+        <w:pStyle w:val="ListParagraph"/>
+        <w:numPr>
+          <w:ilvl w:val="0"/>
+          <w:numId w:val="1"/>
+        </w:numPr>
+      </w:pPr>
+      <w:r>
+        <w:t>Slave</w:t>
+      </w:r>
+    </w:p>
+    <w:p>
+      <w:pPr>
+        <w:pStyle w:val="ListParagraph"/>
+        <w:numPr>
+          <w:ilvl w:val="0"/>
+          <w:numId w:val="1"/>
+        </w:numPr>
+      </w:pPr>
+      <w:r>
+        <w:t>Soldier</w:t>
+      </w:r>
+    </w:p>
+    <w:p>
+      <w:pPr>
+        <w:rPr>
+          <w:lang w:val="en-US"/>
+        </w:rPr>
+      </w:pPr>
+      <w:r>
+        <w:rPr>
+          <w:lang w:val="en-US"/>
+        </w:rPr>
+        <w:t>Roman Trivia</w:t>
+      </w:r>
+    </w:p>
+    <w:p>
+      <w:pPr>
+        <w:pStyle w:val="ListParagraph"/>
+        <w:numPr>
+          <w:ilvl w:val="0"/>
+          <w:numId w:val="2"/>
+        </w:numPr>
+        <w:rPr>
+          <w:lang w:val="en-US"/>
+        </w:rPr>
+      </w:pPr>
+      <w:r>
+        <w:rPr>
+          <w:lang w:val="en-US"/>
+        </w:rPr>
+        <w:t>Roads</w:t>
+      </w:r>
+    </w:p>
+    <w:p>
+      <w:pPr>
+        <w:pStyle w:val="ListParagraph"/>
+        <w:numPr>
+          <w:ilvl w:val="0"/>
+          <w:numId w:val="1"/>
+        </w:numPr>
+        <w:rPr>
+          <w:lang w:val="en-US"/>
+        </w:rPr>
+      </w:pPr>
+      <w:r>
+        <w:rPr>
+          <w:lang w:val="en-US"/>
+        </w:rPr>
+        <w:t>Aqueducts</w:t>
+      </w:r>
+    </w:p>
+    <w:p>
+      <w:pPr>
+        <w:rPr>
+          <w:lang w:val="en-US"/>
+        </w:rPr>
+      </w:pPr>
+      <w:r>
+        <w:rPr>
+          <w:lang w:val="en-US"/>
+        </w:rPr>
+        <w:t>Local Co-op (2 players)</w:t>
+      </w:r>
+    </w:p>
+    <w:p>
+      <w:pPr>
+        <w:rPr>
+          <w:lang w:val="en-US"/>
+        </w:rPr>
+      </w:pPr>
     </w:p>
     <w:sectPr>
       <w:pgSz w:w="12240" w:h="15840"/>
@@ -431,6 +850,241 @@
     </w:sectPr>
   </w:body>
 </w:document>
+</file>
+
+<file path=word/numbering.xml><?xml version="1.0" encoding="utf-8"?>
+<w:numbering xmlns:wpc="http://schemas.microsoft.com/office/word/2010/wordprocessingCanvas" xmlns:cx="http://schemas.microsoft.com/office/drawing/2014/chartex" xmlns:cx1="http://schemas.microsoft.com/office/drawing/2015/9/8/chartex" xmlns:cx2="http://schemas.microsoft.com/office/drawing/2015/10/21/chartex" xmlns:cx3="http://schemas.microsoft.com/office/drawing/2016/5/9/chartex" xmlns:cx4="http://schemas.microsoft.com/office/drawing/2016/5/10/chartex" xmlns:cx5="http://schemas.microsoft.com/office/drawing/2016/5/11/chartex" xmlns:cx6="http://schemas.microsoft.com/office/drawing/2016/5/12/chartex" xmlns:cx7="http://schemas.microsoft.com/office/drawing/2016/5/13/chartex" xmlns:cx8="http://schemas.microsoft.com/office/drawing/2016/5/14/chartex" xmlns:mc="http://schemas.openxmlformats.org/markup-compatibility/2006" xmlns:aink="http://schemas.microsoft.com/office/drawing/2016/ink" xmlns:am3d="http://schemas.microsoft.com/office/drawing/2017/model3d" xmlns:o="urn:schemas-microsoft-com:office:office" xmlns:oel="http://schemas.microsoft.com/office/2019/extlst" xmlns:r="http://schemas.openxmlformats.org/officeDocument/2006/relationships" xmlns:m="http://schemas.openxmlformats.org/officeDocument/2006/math" xmlns:v="urn:schemas-microsoft-com:vml" xmlns:wp14="http://schemas.microsoft.com/office/word/2010/wordprocessingDrawing" xmlns:wp="http://schemas.openxmlformats.org/drawingml/2006/wordprocessingDrawing" xmlns:w10="urn:schemas-microsoft-com:office:word" xmlns:w="http://schemas.openxmlformats.org/wordprocessingml/2006/main" xmlns:w14="http://schemas.microsoft.com/office/word/2010/wordml" xmlns:w15="http://schemas.microsoft.com/office/word/2012/wordml" xmlns:w16cex="http://schemas.microsoft.com/office/word/2018/wordml/cex" xmlns:w16cid="http://schemas.microsoft.com/office/word/2016/wordml/cid" xmlns:w16="http://schemas.microsoft.com/office/word/2018/wordml" xmlns:w16du="http://schemas.microsoft.com/office/word/2023/wordml/word16du" xmlns:w16sdtdh="http://schemas.microsoft.com/office/word/2020/wordml/sdtdatahash" xmlns:w16sdtfl="http://schemas.microsoft.com/office/word/2024/wordml/sdtformatlock" xmlns:w16se="http://schemas.microsoft.com/office/word/2015/wordml/symex" xmlns:wpg="http://schemas.microsoft.com/office/word/2010/wordprocessingGroup" xmlns:wpi="http://schemas.microsoft.com/office/word/2010/wordprocessingInk" xmlns:wne="http://schemas.microsoft.com/office/word/2006/wordml" xmlns:wps="http://schemas.microsoft.com/office/word/2010/wordprocessingShape" mc:Ignorable="w14 w15 w16se w16cid w16 w16cex w16sdtdh w16sdtfl w16du wp14">
+  <w:abstractNum w:abstractNumId="0" w15:restartNumberingAfterBreak="0">
+    <w:nsid w:val="36F766AD"/>
+    <w:multiLevelType w:val="hybridMultilevel"/>
+    <w:tmpl w:val="20360F14"/>
+    <w:lvl w:ilvl="0" w:tplc="BBBCC850">
+      <w:numFmt w:val="bullet"/>
+      <w:lvlText w:val="-"/>
+      <w:lvlJc w:val="left"/>
+      <w:pPr>
+        <w:ind w:left="720" w:hanging="360"/>
+      </w:pPr>
+      <w:rPr>
+        <w:rFonts w:ascii="Aptos" w:eastAsiaTheme="minorHAnsi" w:hAnsi="Aptos" w:cstheme="minorBidi" w:hint="default"/>
+      </w:rPr>
+    </w:lvl>
+    <w:lvl w:ilvl="1" w:tplc="10090003" w:tentative="1">
+      <w:start w:val="1"/>
+      <w:numFmt w:val="bullet"/>
+      <w:lvlText w:val="o"/>
+      <w:lvlJc w:val="left"/>
+      <w:pPr>
+        <w:ind w:left="1440" w:hanging="360"/>
+      </w:pPr>
+      <w:rPr>
+        <w:rFonts w:ascii="Courier New" w:hAnsi="Courier New" w:cs="Courier New" w:hint="default"/>
+      </w:rPr>
+    </w:lvl>
+    <w:lvl w:ilvl="2" w:tplc="10090005" w:tentative="1">
+      <w:start w:val="1"/>
+      <w:numFmt w:val="bullet"/>
+      <w:lvlText w:val=""/>
+      <w:lvlJc w:val="left"/>
+      <w:pPr>
+        <w:ind w:left="2160" w:hanging="360"/>
+      </w:pPr>
+      <w:rPr>
+        <w:rFonts w:ascii="Wingdings" w:hAnsi="Wingdings" w:hint="default"/>
+      </w:rPr>
+    </w:lvl>
+    <w:lvl w:ilvl="3" w:tplc="10090001" w:tentative="1">
+      <w:start w:val="1"/>
+      <w:numFmt w:val="bullet"/>
+      <w:lvlText w:val=""/>
+      <w:lvlJc w:val="left"/>
+      <w:pPr>
+        <w:ind w:left="2880" w:hanging="360"/>
+      </w:pPr>
+      <w:rPr>
+        <w:rFonts w:ascii="Symbol" w:hAnsi="Symbol" w:hint="default"/>
+      </w:rPr>
+    </w:lvl>
+    <w:lvl w:ilvl="4" w:tplc="10090003" w:tentative="1">
+      <w:start w:val="1"/>
+      <w:numFmt w:val="bullet"/>
+      <w:lvlText w:val="o"/>
+      <w:lvlJc w:val="left"/>
+      <w:pPr>
+        <w:ind w:left="3600" w:hanging="360"/>
+      </w:pPr>
+      <w:rPr>
+        <w:rFonts w:ascii="Courier New" w:hAnsi="Courier New" w:cs="Courier New" w:hint="default"/>
+      </w:rPr>
+    </w:lvl>
+    <w:lvl w:ilvl="5" w:tplc="10090005" w:tentative="1">
+      <w:start w:val="1"/>
+      <w:numFmt w:val="bullet"/>
+      <w:lvlText w:val=""/>
+      <w:lvlJc w:val="left"/>
+      <w:pPr>
+        <w:ind w:left="4320" w:hanging="360"/>
+      </w:pPr>
+      <w:rPr>
+        <w:rFonts w:ascii="Wingdings" w:hAnsi="Wingdings" w:hint="default"/>
+      </w:rPr>
+    </w:lvl>
+    <w:lvl w:ilvl="6" w:tplc="10090001" w:tentative="1">
+      <w:start w:val="1"/>
+      <w:numFmt w:val="bullet"/>
+      <w:lvlText w:val=""/>
+      <w:lvlJc w:val="left"/>
+      <w:pPr>
+        <w:ind w:left="5040" w:hanging="360"/>
+      </w:pPr>
+      <w:rPr>
+        <w:rFonts w:ascii="Symbol" w:hAnsi="Symbol" w:hint="default"/>
+      </w:rPr>
+    </w:lvl>
+    <w:lvl w:ilvl="7" w:tplc="10090003" w:tentative="1">
+      <w:start w:val="1"/>
+      <w:numFmt w:val="bullet"/>
+      <w:lvlText w:val="o"/>
+      <w:lvlJc w:val="left"/>
+      <w:pPr>
+        <w:ind w:left="5760" w:hanging="360"/>
+      </w:pPr>
+      <w:rPr>
+        <w:rFonts w:ascii="Courier New" w:hAnsi="Courier New" w:cs="Courier New" w:hint="default"/>
+      </w:rPr>
+    </w:lvl>
+    <w:lvl w:ilvl="8" w:tplc="10090005" w:tentative="1">
+      <w:start w:val="1"/>
+      <w:numFmt w:val="bullet"/>
+      <w:lvlText w:val=""/>
+      <w:lvlJc w:val="left"/>
+      <w:pPr>
+        <w:ind w:left="6480" w:hanging="360"/>
+      </w:pPr>
+      <w:rPr>
+        <w:rFonts w:ascii="Wingdings" w:hAnsi="Wingdings" w:hint="default"/>
+      </w:rPr>
+    </w:lvl>
+  </w:abstractNum>
+  <w:abstractNum w:abstractNumId="1" w15:restartNumberingAfterBreak="0">
+    <w:nsid w:val="4573137E"/>
+    <w:multiLevelType w:val="hybridMultilevel"/>
+    <w:tmpl w:val="C33C4EEC"/>
+    <w:lvl w:ilvl="0" w:tplc="759668E6">
+      <w:numFmt w:val="bullet"/>
+      <w:lvlText w:val="-"/>
+      <w:lvlJc w:val="left"/>
+      <w:pPr>
+        <w:ind w:left="720" w:hanging="360"/>
+      </w:pPr>
+      <w:rPr>
+        <w:rFonts w:ascii="Aptos" w:eastAsiaTheme="minorHAnsi" w:hAnsi="Aptos" w:cstheme="minorBidi" w:hint="default"/>
+      </w:rPr>
+    </w:lvl>
+    <w:lvl w:ilvl="1" w:tplc="10090003" w:tentative="1">
+      <w:start w:val="1"/>
+      <w:numFmt w:val="bullet"/>
+      <w:lvlText w:val="o"/>
+      <w:lvlJc w:val="left"/>
+      <w:pPr>
+        <w:ind w:left="1440" w:hanging="360"/>
+      </w:pPr>
+      <w:rPr>
+        <w:rFonts w:ascii="Courier New" w:hAnsi="Courier New" w:cs="Courier New" w:hint="default"/>
+      </w:rPr>
+    </w:lvl>
+    <w:lvl w:ilvl="2" w:tplc="10090005" w:tentative="1">
+      <w:start w:val="1"/>
+      <w:numFmt w:val="bullet"/>
+      <w:lvlText w:val=""/>
+      <w:lvlJc w:val="left"/>
+      <w:pPr>
+        <w:ind w:left="2160" w:hanging="360"/>
+      </w:pPr>
+      <w:rPr>
+        <w:rFonts w:ascii="Wingdings" w:hAnsi="Wingdings" w:hint="default"/>
+      </w:rPr>
+    </w:lvl>
+    <w:lvl w:ilvl="3" w:tplc="10090001" w:tentative="1">
+      <w:start w:val="1"/>
+      <w:numFmt w:val="bullet"/>
+      <w:lvlText w:val=""/>
+      <w:lvlJc w:val="left"/>
+      <w:pPr>
+        <w:ind w:left="2880" w:hanging="360"/>
+      </w:pPr>
+      <w:rPr>
+        <w:rFonts w:ascii="Symbol" w:hAnsi="Symbol" w:hint="default"/>
+      </w:rPr>
+    </w:lvl>
+    <w:lvl w:ilvl="4" w:tplc="10090003" w:tentative="1">
+      <w:start w:val="1"/>
+      <w:numFmt w:val="bullet"/>
+      <w:lvlText w:val="o"/>
+      <w:lvlJc w:val="left"/>
+      <w:pPr>
+        <w:ind w:left="3600" w:hanging="360"/>
+      </w:pPr>
+      <w:rPr>
+        <w:rFonts w:ascii="Courier New" w:hAnsi="Courier New" w:cs="Courier New" w:hint="default"/>
+      </w:rPr>
+    </w:lvl>
+    <w:lvl w:ilvl="5" w:tplc="10090005" w:tentative="1">
+      <w:start w:val="1"/>
+      <w:numFmt w:val="bullet"/>
+      <w:lvlText w:val=""/>
+      <w:lvlJc w:val="left"/>
+      <w:pPr>
+        <w:ind w:left="4320" w:hanging="360"/>
+      </w:pPr>
+      <w:rPr>
+        <w:rFonts w:ascii="Wingdings" w:hAnsi="Wingdings" w:hint="default"/>
+      </w:rPr>
+    </w:lvl>
+    <w:lvl w:ilvl="6" w:tplc="10090001" w:tentative="1">
+      <w:start w:val="1"/>
+      <w:numFmt w:val="bullet"/>
+      <w:lvlText w:val=""/>
+      <w:lvlJc w:val="left"/>
+      <w:pPr>
+        <w:ind w:left="5040" w:hanging="360"/>
+      </w:pPr>
+      <w:rPr>
+        <w:rFonts w:ascii="Symbol" w:hAnsi="Symbol" w:hint="default"/>
+      </w:rPr>
+    </w:lvl>
+    <w:lvl w:ilvl="7" w:tplc="10090003" w:tentative="1">
+      <w:start w:val="1"/>
+      <w:numFmt w:val="bullet"/>
+      <w:lvlText w:val="o"/>
+      <w:lvlJc w:val="left"/>
+      <w:pPr>
+        <w:ind w:left="5760" w:hanging="360"/>
+      </w:pPr>
+      <w:rPr>
+        <w:rFonts w:ascii="Courier New" w:hAnsi="Courier New" w:cs="Courier New" w:hint="default"/>
+      </w:rPr>
+    </w:lvl>
+    <w:lvl w:ilvl="8" w:tplc="10090005" w:tentative="1">
+      <w:start w:val="1"/>
+      <w:numFmt w:val="bullet"/>
+      <w:lvlText w:val=""/>
+      <w:lvlJc w:val="left"/>
+      <w:pPr>
+        <w:ind w:left="6480" w:hanging="360"/>
+      </w:pPr>
+      <w:rPr>
+        <w:rFonts w:ascii="Wingdings" w:hAnsi="Wingdings" w:hint="default"/>
+      </w:rPr>
+    </w:lvl>
+  </w:abstractNum>
+  <w:num w:numId="1" w16cid:durableId="487404035">
+    <w:abstractNumId w:val="0"/>
+  </w:num>
+  <w:num w:numId="2" w16cid:durableId="201982790">
+    <w:abstractNumId w:val="1"/>
+  </w:num>
+</w:numbering>
 </file>
 
 <file path=word/styles.xml><?xml version="1.0" encoding="utf-8"?>
@@ -1036,7 +1690,6 @@
   <w:style w:type="character" w:default="1" w:styleId="DefaultParagraphFont">
     <w:name w:val="Default Paragraph Font"/>
     <w:uiPriority w:val="1"/>
-    <w:semiHidden/>
     <w:unhideWhenUsed/>
   </w:style>
   <w:style w:type="table" w:default="1" w:styleId="TableNormal">

</xml_diff>

<commit_message>
added initial main menu
</commit_message>
<xml_diff>
--- a/Content/Docs/GDD_Murder_In_Purple.docx
+++ b/Content/Docs/GDD_Murder_In_Purple.docx
@@ -4,12 +4,21 @@
   <w:body>
     <w:p>
       <w:pPr>
-        <w:rPr>
-          <w:lang w:val="en-US"/>
-        </w:rPr>
-      </w:pPr>
-      <w:r>
-        <w:rPr>
+        <w:jc w:val="center"/>
+        <w:rPr>
+          <w:b/>
+          <w:bCs/>
+          <w:sz w:val="32"/>
+          <w:szCs w:val="32"/>
+          <w:lang w:val="en-US"/>
+        </w:rPr>
+      </w:pPr>
+      <w:r>
+        <w:rPr>
+          <w:b/>
+          <w:bCs/>
+          <w:sz w:val="32"/>
+          <w:szCs w:val="32"/>
           <w:lang w:val="en-US"/>
         </w:rPr>
         <w:t>Murder In Purple</w:t>
@@ -17,112 +26,12 @@
     </w:p>
     <w:p>
       <w:pPr>
-        <w:rPr>
-          <w:lang w:val="en-US"/>
-        </w:rPr>
-      </w:pPr>
-    </w:p>
-    <w:p>
-      <w:pPr>
-        <w:rPr>
-          <w:lang w:val="en-US"/>
-        </w:rPr>
-      </w:pPr>
-    </w:p>
-    <w:p>
-      <w:pPr>
-        <w:rPr>
-          <w:lang w:val="en-US"/>
-        </w:rPr>
-      </w:pPr>
-    </w:p>
-    <w:p>
-      <w:pPr>
-        <w:rPr>
-          <w:lang w:val="en-US"/>
-        </w:rPr>
-      </w:pPr>
-    </w:p>
-    <w:p>
-      <w:pPr>
-        <w:rPr>
-          <w:lang w:val="en-US"/>
-        </w:rPr>
-      </w:pPr>
-    </w:p>
-    <w:p>
-      <w:pPr>
-        <w:rPr>
-          <w:lang w:val="en-US"/>
-        </w:rPr>
-      </w:pPr>
-    </w:p>
-    <w:p>
-      <w:pPr>
-        <w:rPr>
-          <w:lang w:val="en-US"/>
-        </w:rPr>
-      </w:pPr>
-    </w:p>
-    <w:p>
-      <w:pPr>
-        <w:rPr>
-          <w:lang w:val="en-US"/>
-        </w:rPr>
-      </w:pPr>
-    </w:p>
-    <w:p>
-      <w:pPr>
-        <w:rPr>
-          <w:lang w:val="en-US"/>
-        </w:rPr>
-      </w:pPr>
-    </w:p>
-    <w:p>
-      <w:pPr>
-        <w:rPr>
-          <w:lang w:val="en-US"/>
-        </w:rPr>
-      </w:pPr>
-    </w:p>
-    <w:p>
-      <w:pPr>
-        <w:rPr>
-          <w:lang w:val="en-US"/>
-        </w:rPr>
-      </w:pPr>
-    </w:p>
-    <w:p>
-      <w:pPr>
-        <w:rPr>
-          <w:lang w:val="en-US"/>
-        </w:rPr>
-      </w:pPr>
-    </w:p>
-    <w:p>
-      <w:pPr>
-        <w:rPr>
-          <w:lang w:val="en-US"/>
-        </w:rPr>
-      </w:pPr>
-    </w:p>
-    <w:p>
-      <w:pPr>
-        <w:rPr>
-          <w:lang w:val="en-US"/>
-        </w:rPr>
-      </w:pPr>
-    </w:p>
-    <w:p>
-      <w:pPr>
-        <w:rPr>
-          <w:lang w:val="en-US"/>
-        </w:rPr>
-      </w:pPr>
-    </w:p>
-    <w:p>
-      <w:pPr>
-        <w:rPr>
+        <w:jc w:val="center"/>
+        <w:rPr>
+          <w:b/>
+          <w:bCs/>
+          <w:sz w:val="32"/>
+          <w:szCs w:val="32"/>
           <w:lang w:val="en-US"/>
         </w:rPr>
       </w:pPr>
@@ -150,84 +59,202 @@
     <w:p>
       <w:pPr>
         <w:rPr>
-          <w:lang w:val="en-US"/>
-        </w:rPr>
-      </w:pPr>
-    </w:p>
-    <w:p>
-      <w:pPr>
-        <w:rPr>
-          <w:lang w:val="en-US"/>
-        </w:rPr>
-      </w:pPr>
-    </w:p>
-    <w:p>
-      <w:pPr>
-        <w:rPr>
-          <w:lang w:val="en-US"/>
-        </w:rPr>
-      </w:pPr>
-    </w:p>
-    <w:p>
-      <w:pPr>
-        <w:rPr>
-          <w:lang w:val="en-US"/>
-        </w:rPr>
-      </w:pPr>
-    </w:p>
-    <w:p>
-      <w:pPr>
-        <w:rPr>
-          <w:lang w:val="en-US"/>
-        </w:rPr>
-      </w:pPr>
-    </w:p>
-    <w:p>
-      <w:pPr>
-        <w:rPr>
-          <w:lang w:val="en-US"/>
-        </w:rPr>
-      </w:pPr>
-    </w:p>
-    <w:p>
-      <w:pPr>
-        <w:rPr>
-          <w:lang w:val="en-US"/>
-        </w:rPr>
-      </w:pPr>
-    </w:p>
-    <w:p>
-      <w:pPr>
-        <w:rPr>
-          <w:lang w:val="en-US"/>
-        </w:rPr>
-      </w:pPr>
-    </w:p>
-    <w:p>
-      <w:pPr>
-        <w:rPr>
-          <w:lang w:val="en-US"/>
-        </w:rPr>
-      </w:pPr>
-    </w:p>
-    <w:p>
-      <w:pPr>
-        <w:rPr>
-          <w:lang w:val="en-US"/>
-        </w:rPr>
-      </w:pPr>
-    </w:p>
-    <w:p>
-      <w:pPr>
-        <w:rPr>
-          <w:lang w:val="en-US"/>
-        </w:rPr>
-      </w:pPr>
-    </w:p>
-    <w:p>
-      <w:pPr>
-        <w:rPr>
-          <w:lang w:val="en-US"/>
+          <w:b/>
+          <w:bCs/>
+          <w:lang w:val="en-US"/>
+        </w:rPr>
+      </w:pPr>
+      <w:r>
+        <w:rPr>
+          <w:b/>
+          <w:bCs/>
+          <w:lang w:val="en-US"/>
+        </w:rPr>
+        <w:t>Introduction</w:t>
+      </w:r>
+    </w:p>
+    <w:p>
+      <w:pPr>
+        <w:rPr>
+          <w:lang w:val="en-US"/>
+        </w:rPr>
+      </w:pPr>
+      <w:r>
+        <w:rPr>
+          <w:b/>
+          <w:bCs/>
+          <w:lang w:val="en-US"/>
+        </w:rPr>
+        <w:tab/>
+      </w:r>
+      <w:r>
+        <w:rPr>
+          <w:lang w:val="en-US"/>
+        </w:rPr>
+        <w:t xml:space="preserve">Murder in Purple is a murder mystery set in Roman times. It happens in four acts. Each act will have an investigation, and the end of the investigation completes the act. The first three acts will happen in separate and independent but contiguous regions. The story happens in an island and starts at the </w:t>
+      </w:r>
+      <w:r>
+        <w:rPr>
+          <w:lang w:val="en-US"/>
+        </w:rPr>
+        <w:t>player’s</w:t>
+      </w:r>
+      <w:r>
+        <w:rPr>
+          <w:lang w:val="en-US"/>
+        </w:rPr>
+        <w:t xml:space="preserve"> house.</w:t>
+      </w:r>
+    </w:p>
+    <w:p>
+      <w:pPr>
+        <w:rPr>
+          <w:lang w:val="en-US"/>
+        </w:rPr>
+      </w:pPr>
+    </w:p>
+    <w:p>
+      <w:pPr>
+        <w:rPr>
+          <w:b/>
+          <w:bCs/>
+          <w:lang w:val="en-US"/>
+        </w:rPr>
+      </w:pPr>
+      <w:r>
+        <w:rPr>
+          <w:b/>
+          <w:bCs/>
+          <w:lang w:val="en-US"/>
+        </w:rPr>
+        <w:t>Act 1</w:t>
+      </w:r>
+    </w:p>
+    <w:p>
+      <w:pPr>
+        <w:rPr>
+          <w:lang w:val="en-US"/>
+        </w:rPr>
+      </w:pPr>
+      <w:r>
+        <w:rPr>
+          <w:lang w:val="en-US"/>
+        </w:rPr>
+        <w:tab/>
+      </w:r>
+    </w:p>
+    <w:p>
+      <w:pPr>
+        <w:rPr>
+          <w:lang w:val="en-US"/>
+        </w:rPr>
+      </w:pPr>
+    </w:p>
+    <w:p>
+      <w:pPr>
+        <w:rPr>
+          <w:b/>
+          <w:bCs/>
+          <w:lang w:val="en-US"/>
+        </w:rPr>
+      </w:pPr>
+      <w:r>
+        <w:rPr>
+          <w:b/>
+          <w:bCs/>
+          <w:lang w:val="en-US"/>
+        </w:rPr>
+        <w:t xml:space="preserve">Act </w:t>
+      </w:r>
+      <w:r>
+        <w:rPr>
+          <w:b/>
+          <w:bCs/>
+          <w:lang w:val="en-US"/>
+        </w:rPr>
+        <w:t>2</w:t>
+      </w:r>
+    </w:p>
+    <w:p>
+      <w:pPr>
+        <w:rPr>
+          <w:lang w:val="en-US"/>
+        </w:rPr>
+      </w:pPr>
+    </w:p>
+    <w:p>
+      <w:pPr>
+        <w:rPr>
+          <w:b/>
+          <w:bCs/>
+          <w:lang w:val="en-US"/>
+        </w:rPr>
+      </w:pPr>
+      <w:r>
+        <w:rPr>
+          <w:b/>
+          <w:bCs/>
+          <w:lang w:val="en-US"/>
+        </w:rPr>
+        <w:t xml:space="preserve">Act </w:t>
+      </w:r>
+      <w:r>
+        <w:rPr>
+          <w:b/>
+          <w:bCs/>
+          <w:lang w:val="en-US"/>
+        </w:rPr>
+        <w:t>3</w:t>
+      </w:r>
+    </w:p>
+    <w:p>
+      <w:pPr>
+        <w:rPr>
+          <w:b/>
+          <w:bCs/>
+          <w:lang w:val="en-US"/>
+        </w:rPr>
+      </w:pPr>
+    </w:p>
+    <w:p>
+      <w:pPr>
+        <w:rPr>
+          <w:b/>
+          <w:bCs/>
+          <w:lang w:val="en-US"/>
+        </w:rPr>
+      </w:pPr>
+      <w:r>
+        <w:rPr>
+          <w:b/>
+          <w:bCs/>
+          <w:lang w:val="en-US"/>
+        </w:rPr>
+        <w:t xml:space="preserve">Act </w:t>
+      </w:r>
+      <w:r>
+        <w:rPr>
+          <w:b/>
+          <w:bCs/>
+          <w:lang w:val="en-US"/>
+        </w:rPr>
+        <w:t>4</w:t>
+      </w:r>
+    </w:p>
+    <w:p>
+      <w:pPr>
+        <w:rPr>
+          <w:b/>
+          <w:bCs/>
+          <w:lang w:val="en-US"/>
+        </w:rPr>
+      </w:pPr>
+    </w:p>
+    <w:p>
+      <w:pPr>
+        <w:rPr>
+          <w:b/>
+          <w:bCs/>
         </w:rPr>
       </w:pPr>
       <w:r>
@@ -244,14 +271,21 @@
           <w:lang w:val="en-US"/>
         </w:rPr>
       </w:pPr>
+    </w:p>
+    <w:p>
+      <w:pPr>
+        <w:rPr>
+          <w:lang w:val="en-US"/>
+        </w:rPr>
+      </w:pPr>
       <w:r>
         <w:rPr>
           <w:noProof/>
         </w:rPr>
         <w:drawing>
-          <wp:inline distT="0" distB="0" distL="0" distR="0" wp14:anchorId="0EBC3180" wp14:editId="7E4CE2B3">
-            <wp:extent cx="3600450" cy="1266825"/>
-            <wp:effectExtent l="0" t="0" r="0" b="9525"/>
+          <wp:inline distT="0" distB="0" distL="0" distR="0" wp14:anchorId="0EBC3180" wp14:editId="3C43D794">
+            <wp:extent cx="2447223" cy="861060"/>
+            <wp:effectExtent l="0" t="0" r="0" b="0"/>
             <wp:docPr id="474068630" name="Picture 1" descr="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"/>
             <wp:cNvGraphicFramePr>
               <a:graphicFrameLocks xmlns:a="http://schemas.openxmlformats.org/drawingml/2006/main" noChangeAspect="1"/>
@@ -281,7 +315,7 @@
                   <pic:spPr bwMode="auto">
                     <a:xfrm>
                       <a:off x="0" y="0"/>
-                      <a:ext cx="3600450" cy="1266825"/>
+                      <a:ext cx="2452073" cy="862767"/>
                     </a:xfrm>
                     <a:prstGeom prst="rect">
                       <a:avLst/>
@@ -349,11 +383,82 @@
           <w:lang w:val="en-US"/>
         </w:rPr>
       </w:pPr>
-      <w:r>
-        <w:rPr>
-          <w:lang w:val="en-US"/>
-        </w:rPr>
-        <w:t>https://www.syntystudios.com/</w:t>
+      <w:hyperlink r:id="rId6" w:history="1">
+        <w:r>
+          <w:rPr>
+            <w:rStyle w:val="Hyperlink"/>
+            <w:lang w:val="en-US"/>
+          </w:rPr>
+          <w:t>https://www.syntystudios.com/</w:t>
+        </w:r>
+      </w:hyperlink>
+    </w:p>
+    <w:p>
+      <w:pPr>
+        <w:rPr>
+          <w:lang w:val="en-US"/>
+        </w:rPr>
+      </w:pPr>
+    </w:p>
+    <w:p>
+      <w:pPr>
+        <w:rPr>
+          <w:lang w:val="en-US"/>
+        </w:rPr>
+      </w:pPr>
+      <w:r>
+        <w:rPr>
+          <w:noProof/>
+        </w:rPr>
+        <w:lastRenderedPageBreak/>
+        <w:drawing>
+          <wp:inline distT="0" distB="0" distL="0" distR="0" wp14:anchorId="32588400" wp14:editId="24E3F882">
+            <wp:extent cx="2316480" cy="735096"/>
+            <wp:effectExtent l="0" t="0" r="7620" b="8255"/>
+            <wp:docPr id="1193472020" name="Picture 2" descr="A black background with white text&#10;&#10;AI-generated content may be incorrect."/>
+            <wp:cNvGraphicFramePr>
+              <a:graphicFrameLocks xmlns:a="http://schemas.openxmlformats.org/drawingml/2006/main" noChangeAspect="1"/>
+            </wp:cNvGraphicFramePr>
+            <a:graphic xmlns:a="http://schemas.openxmlformats.org/drawingml/2006/main">
+              <a:graphicData uri="http://schemas.openxmlformats.org/drawingml/2006/picture">
+                <pic:pic xmlns:pic="http://schemas.openxmlformats.org/drawingml/2006/picture">
+                  <pic:nvPicPr>
+                    <pic:cNvPr id="1193472020" name="Picture 2" descr="A black background with white text&#10;&#10;AI-generated content may be incorrect."/>
+                    <pic:cNvPicPr>
+                      <a:picLocks noChangeAspect="1" noChangeArrowheads="1"/>
+                    </pic:cNvPicPr>
+                  </pic:nvPicPr>
+                  <pic:blipFill>
+                    <a:blip r:embed="rId7">
+                      <a:extLst>
+                        <a:ext uri="{28A0092B-C50C-407E-A947-70E740481C1C}">
+                          <a14:useLocalDpi xmlns:a14="http://schemas.microsoft.com/office/drawing/2010/main" val="0"/>
+                        </a:ext>
+                      </a:extLst>
+                    </a:blip>
+                    <a:srcRect/>
+                    <a:stretch>
+                      <a:fillRect/>
+                    </a:stretch>
+                  </pic:blipFill>
+                  <pic:spPr bwMode="auto">
+                    <a:xfrm>
+                      <a:off x="0" y="0"/>
+                      <a:ext cx="2326629" cy="738317"/>
+                    </a:xfrm>
+                    <a:prstGeom prst="rect">
+                      <a:avLst/>
+                    </a:prstGeom>
+                    <a:noFill/>
+                    <a:ln>
+                      <a:noFill/>
+                    </a:ln>
+                  </pic:spPr>
+                </pic:pic>
+              </a:graphicData>
+            </a:graphic>
+          </wp:inline>
+        </w:drawing>
       </w:r>
     </w:p>
     <w:p>
@@ -416,7 +521,7 @@
           <w:lang w:val="en-US"/>
         </w:rPr>
       </w:pPr>
-      <w:hyperlink r:id="rId6" w:history="1">
+      <w:hyperlink r:id="rId8" w:history="1">
         <w:r>
           <w:rPr>
             <w:rStyle w:val="Hyperlink"/>
@@ -460,21 +565,7 @@
         <w:rPr>
           <w:lang w:val="en-US"/>
         </w:rPr>
-        <w:t xml:space="preserve">Sherlock Holmes: Crimes and Punishment – Most important </w:t>
-      </w:r>
-      <w:proofErr w:type="gramStart"/>
-      <w:r>
-        <w:rPr>
-          <w:lang w:val="en-US"/>
-        </w:rPr>
-        <w:t>( UI</w:t>
-      </w:r>
-      <w:proofErr w:type="gramEnd"/>
-      <w:r>
-        <w:rPr>
-          <w:lang w:val="en-US"/>
-        </w:rPr>
-        <w:t xml:space="preserve"> for investigation, except for weird word addition)</w:t>
+        <w:t>Sherlock Holmes: Crimes and Punishment –  UI for investigation, except for weird word addition</w:t>
       </w:r>
     </w:p>
     <w:p>
@@ -521,14 +612,12 @@
         </w:rPr>
         <w:t xml:space="preserve"> </w:t>
       </w:r>
-      <w:proofErr w:type="gramStart"/>
-      <w:r>
-        <w:rPr>
-          <w:lang w:val="en-US"/>
-        </w:rPr>
-        <w:t>( UI</w:t>
-      </w:r>
-      <w:proofErr w:type="gramEnd"/>
+      <w:r>
+        <w:rPr>
+          <w:lang w:val="en-US"/>
+        </w:rPr>
+        <w:t>(UI</w:t>
+      </w:r>
       <w:r>
         <w:rPr>
           <w:lang w:val="en-US"/>
@@ -552,9 +641,183 @@
     <w:p>
       <w:pPr>
         <w:rPr>
-          <w:lang w:val="en-US"/>
-        </w:rPr>
-      </w:pPr>
+          <w:b/>
+          <w:bCs/>
+          <w:lang w:val="en-US"/>
+        </w:rPr>
+      </w:pPr>
+      <w:r>
+        <w:rPr>
+          <w:b/>
+          <w:bCs/>
+          <w:lang w:val="en-US"/>
+        </w:rPr>
+        <w:t>Story</w:t>
+      </w:r>
+    </w:p>
+    <w:p>
+      <w:r>
+        <w:rPr>
+          <w:lang w:val="en-US"/>
+        </w:rPr>
+        <w:t xml:space="preserve">The main character is either a </w:t>
+      </w:r>
+      <w:r>
+        <w:t>Praefectus Urbi</w:t>
+      </w:r>
+      <w:r>
+        <w:t xml:space="preserve"> or their servant/slave. He will be charged with investigating what’s happening in the island. </w:t>
+      </w:r>
+      <w:r>
+        <w:t>The</w:t>
+      </w:r>
+      <w:r>
+        <w:t xml:space="preserve"> slave can read so he works as a secretary for the Praefectus. The motivation of the player as the Slave is to become a freeman. The slave is in love with the other Slave and is motivated to become free but is kept loyal because he wants to keep his relationship with the other slave.</w:t>
+      </w:r>
+    </w:p>
+    <w:p/>
+    <w:p>
+      <w:pPr>
+        <w:rPr>
+          <w:b/>
+          <w:bCs/>
+        </w:rPr>
+      </w:pPr>
+      <w:r>
+        <w:rPr>
+          <w:b/>
+          <w:bCs/>
+        </w:rPr>
+        <w:t>Characters</w:t>
+      </w:r>
+    </w:p>
+    <w:p>
+      <w:r>
+        <w:t xml:space="preserve">Alexius </w:t>
+      </w:r>
+      <w:r>
+        <w:t>Philon</w:t>
+      </w:r>
+      <w:r>
+        <w:t xml:space="preserve"> - </w:t>
+      </w:r>
+      <w:r>
+        <w:t>Praefectus Urbi</w:t>
+      </w:r>
+    </w:p>
+    <w:p/>
+    <w:p>
+      <w:r>
+        <w:t>Primus</w:t>
+      </w:r>
+      <w:r>
+        <w:t xml:space="preserve"> </w:t>
+      </w:r>
+      <w:r>
+        <w:t>(</w:t>
+      </w:r>
+      <w:r>
+        <w:t>Petros Angelos</w:t>
+      </w:r>
+      <w:r>
+        <w:t>) -</w:t>
+      </w:r>
+      <w:r>
+        <w:t xml:space="preserve"> </w:t>
+      </w:r>
+      <w:r>
+        <w:t>Slave – (</w:t>
+      </w:r>
+      <w:r>
+        <w:t xml:space="preserve"> Primus is his </w:t>
+      </w:r>
+      <w:r>
+        <w:t>slave nickname</w:t>
+      </w:r>
+      <w:r>
+        <w:t xml:space="preserve"> but he remembers his true name</w:t>
+      </w:r>
+      <w:r>
+        <w:t>)</w:t>
+      </w:r>
+    </w:p>
+    <w:p>
+      <w:r>
+        <w:tab/>
+        <w:t xml:space="preserve">Primus is from the Angeloi family. He was reduced to slavery and the conquest of Thyra. </w:t>
+      </w:r>
+    </w:p>
+    <w:p>
+      <w:r>
+        <w:t>Diana</w:t>
+      </w:r>
+    </w:p>
+    <w:p/>
+    <w:p>
+      <w:pPr>
+        <w:rPr>
+          <w:b/>
+          <w:bCs/>
+        </w:rPr>
+      </w:pPr>
+      <w:r>
+        <w:rPr>
+          <w:b/>
+          <w:bCs/>
+        </w:rPr>
+        <w:t>Core Gameplay Mechanics</w:t>
+      </w:r>
+    </w:p>
+    <w:p>
+      <w:pPr>
+        <w:rPr>
+          <w:b/>
+          <w:bCs/>
+        </w:rPr>
+      </w:pPr>
+    </w:p>
+    <w:p>
+      <w:pPr>
+        <w:rPr>
+          <w:b/>
+          <w:bCs/>
+        </w:rPr>
+      </w:pPr>
+    </w:p>
+    <w:p/>
+    <w:p>
+      <w:pPr>
+        <w:rPr>
+          <w:b/>
+          <w:bCs/>
+        </w:rPr>
+      </w:pPr>
+      <w:r>
+        <w:rPr>
+          <w:b/>
+          <w:bCs/>
+        </w:rPr>
+        <w:t xml:space="preserve">Dreams For </w:t>
+      </w:r>
+      <w:r>
+        <w:rPr>
+          <w:b/>
+          <w:bCs/>
+        </w:rPr>
+        <w:t>the</w:t>
+      </w:r>
+      <w:r>
+        <w:rPr>
+          <w:b/>
+          <w:bCs/>
+        </w:rPr>
+        <w:t xml:space="preserve"> Game</w:t>
+      </w:r>
+    </w:p>
+    <w:p>
+      <w:r>
+        <w:t>Character Selection</w:t>
+      </w:r>
     </w:p>
     <w:p>
       <w:pPr>
@@ -563,191 +826,10 @@
           <w:ilvl w:val="0"/>
           <w:numId w:val="1"/>
         </w:numPr>
-        <w:rPr>
-          <w:lang w:val="en-US"/>
-        </w:rPr>
-      </w:pPr>
-    </w:p>
-    <w:p>
-      <w:pPr>
-        <w:rPr>
-          <w:lang w:val="en-US"/>
-        </w:rPr>
-      </w:pPr>
-    </w:p>
-    <w:p>
-      <w:pPr>
-        <w:rPr>
-          <w:b/>
-          <w:bCs/>
-          <w:lang w:val="en-US"/>
-        </w:rPr>
-      </w:pPr>
-      <w:r>
-        <w:rPr>
-          <w:b/>
-          <w:bCs/>
-          <w:lang w:val="en-US"/>
-        </w:rPr>
-        <w:lastRenderedPageBreak/>
-        <w:t>Story</w:t>
-      </w:r>
-    </w:p>
-    <w:p>
-      <w:r>
-        <w:rPr>
-          <w:lang w:val="en-US"/>
-        </w:rPr>
-        <w:t xml:space="preserve">The main character is either a </w:t>
-      </w:r>
-      <w:proofErr w:type="spellStart"/>
+      </w:pPr>
       <w:r>
         <w:t>Praefectus</w:t>
       </w:r>
-      <w:proofErr w:type="spellEnd"/>
-      <w:r>
-        <w:t xml:space="preserve"> Urbi</w:t>
-      </w:r>
-      <w:r>
-        <w:t xml:space="preserve"> or their servant/slave. He will be charged with investigating what’s happening in the island. </w:t>
-      </w:r>
-      <w:r>
-        <w:t>The</w:t>
-      </w:r>
-      <w:r>
-        <w:t xml:space="preserve"> slave can read so he works as a secretary for the </w:t>
-      </w:r>
-      <w:proofErr w:type="spellStart"/>
-      <w:r>
-        <w:t>Praefectus</w:t>
-      </w:r>
-      <w:proofErr w:type="spellEnd"/>
-      <w:r>
-        <w:t>. The motivation of the player as the Slave is to become a freeman. The slave is in love with the other Slave and is motivated to become free but is kept loyal because he wants to keep his relationship with the other slave.</w:t>
-      </w:r>
-    </w:p>
-    <w:p/>
-    <w:p>
-      <w:pPr>
-        <w:rPr>
-          <w:b/>
-          <w:bCs/>
-        </w:rPr>
-      </w:pPr>
-      <w:r>
-        <w:rPr>
-          <w:b/>
-          <w:bCs/>
-        </w:rPr>
-        <w:t>Characters</w:t>
-      </w:r>
-    </w:p>
-    <w:p>
-      <w:proofErr w:type="spellStart"/>
-      <w:r>
-        <w:t>Praefectus</w:t>
-      </w:r>
-      <w:proofErr w:type="spellEnd"/>
-      <w:r>
-        <w:t xml:space="preserve"> Urbi</w:t>
-      </w:r>
-    </w:p>
-    <w:p>
-      <w:r>
-        <w:t xml:space="preserve">Slave – </w:t>
-      </w:r>
-      <w:r>
-        <w:t>Primus</w:t>
-      </w:r>
-      <w:r>
-        <w:t xml:space="preserve"> (slave nickname)</w:t>
-      </w:r>
-    </w:p>
-    <w:p>
-      <w:r>
-        <w:t>Diana</w:t>
-      </w:r>
-    </w:p>
-    <w:p/>
-    <w:p>
-      <w:pPr>
-        <w:rPr>
-          <w:b/>
-          <w:bCs/>
-        </w:rPr>
-      </w:pPr>
-      <w:r>
-        <w:rPr>
-          <w:b/>
-          <w:bCs/>
-        </w:rPr>
-        <w:t>Core Gameplay Mechanics</w:t>
-      </w:r>
-    </w:p>
-    <w:p>
-      <w:pPr>
-        <w:rPr>
-          <w:b/>
-          <w:bCs/>
-        </w:rPr>
-      </w:pPr>
-    </w:p>
-    <w:p>
-      <w:pPr>
-        <w:rPr>
-          <w:b/>
-          <w:bCs/>
-        </w:rPr>
-      </w:pPr>
-    </w:p>
-    <w:p/>
-    <w:p>
-      <w:pPr>
-        <w:rPr>
-          <w:b/>
-          <w:bCs/>
-        </w:rPr>
-      </w:pPr>
-      <w:r>
-        <w:rPr>
-          <w:b/>
-          <w:bCs/>
-        </w:rPr>
-        <w:t xml:space="preserve">Dreams For </w:t>
-      </w:r>
-      <w:r>
-        <w:rPr>
-          <w:b/>
-          <w:bCs/>
-        </w:rPr>
-        <w:t>the</w:t>
-      </w:r>
-      <w:r>
-        <w:rPr>
-          <w:b/>
-          <w:bCs/>
-        </w:rPr>
-        <w:t xml:space="preserve"> Game</w:t>
-      </w:r>
-    </w:p>
-    <w:p>
-      <w:r>
-        <w:t>Character Selection</w:t>
-      </w:r>
-    </w:p>
-    <w:p>
-      <w:pPr>
-        <w:pStyle w:val="ListParagraph"/>
-        <w:numPr>
-          <w:ilvl w:val="0"/>
-          <w:numId w:val="1"/>
-        </w:numPr>
-      </w:pPr>
-      <w:proofErr w:type="spellStart"/>
-      <w:r>
-        <w:t>Praefectus</w:t>
-      </w:r>
-      <w:proofErr w:type="spellEnd"/>
     </w:p>
     <w:p>
       <w:pPr>

</xml_diff>

<commit_message>
updated unreal version and document. Also cleaned up unnecessary levels
</commit_message>
<xml_diff>
--- a/Content/Docs/GDD_Murder_In_Purple.docx
+++ b/Content/Docs/GDD_Murder_In_Purple.docx
@@ -59,6 +59,237 @@
     <w:p>
       <w:pPr>
         <w:rPr>
+          <w:lang w:val="en-US"/>
+        </w:rPr>
+      </w:pPr>
+    </w:p>
+    <w:p>
+      <w:pPr>
+        <w:rPr>
+          <w:lang w:val="en-US"/>
+        </w:rPr>
+      </w:pPr>
+    </w:p>
+    <w:p>
+      <w:pPr>
+        <w:rPr>
+          <w:lang w:val="en-US"/>
+        </w:rPr>
+      </w:pPr>
+    </w:p>
+    <w:p>
+      <w:pPr>
+        <w:rPr>
+          <w:lang w:val="en-US"/>
+        </w:rPr>
+      </w:pPr>
+    </w:p>
+    <w:p>
+      <w:pPr>
+        <w:rPr>
+          <w:lang w:val="en-US"/>
+        </w:rPr>
+      </w:pPr>
+    </w:p>
+    <w:p>
+      <w:pPr>
+        <w:rPr>
+          <w:lang w:val="en-US"/>
+        </w:rPr>
+      </w:pPr>
+    </w:p>
+    <w:p>
+      <w:pPr>
+        <w:rPr>
+          <w:lang w:val="en-US"/>
+        </w:rPr>
+      </w:pPr>
+    </w:p>
+    <w:p>
+      <w:pPr>
+        <w:rPr>
+          <w:lang w:val="en-US"/>
+        </w:rPr>
+      </w:pPr>
+    </w:p>
+    <w:p>
+      <w:pPr>
+        <w:rPr>
+          <w:lang w:val="en-US"/>
+        </w:rPr>
+      </w:pPr>
+    </w:p>
+    <w:p>
+      <w:pPr>
+        <w:rPr>
+          <w:lang w:val="en-US"/>
+        </w:rPr>
+      </w:pPr>
+    </w:p>
+    <w:p>
+      <w:pPr>
+        <w:rPr>
+          <w:lang w:val="en-US"/>
+        </w:rPr>
+      </w:pPr>
+    </w:p>
+    <w:p>
+      <w:pPr>
+        <w:rPr>
+          <w:lang w:val="en-US"/>
+        </w:rPr>
+      </w:pPr>
+    </w:p>
+    <w:p>
+      <w:pPr>
+        <w:rPr>
+          <w:lang w:val="en-US"/>
+        </w:rPr>
+      </w:pPr>
+    </w:p>
+    <w:p>
+      <w:pPr>
+        <w:rPr>
+          <w:lang w:val="en-US"/>
+        </w:rPr>
+      </w:pPr>
+    </w:p>
+    <w:p>
+      <w:pPr>
+        <w:rPr>
+          <w:lang w:val="en-US"/>
+        </w:rPr>
+      </w:pPr>
+    </w:p>
+    <w:p>
+      <w:pPr>
+        <w:rPr>
+          <w:lang w:val="en-US"/>
+        </w:rPr>
+      </w:pPr>
+    </w:p>
+    <w:p>
+      <w:pPr>
+        <w:rPr>
+          <w:lang w:val="en-US"/>
+        </w:rPr>
+      </w:pPr>
+    </w:p>
+    <w:p>
+      <w:pPr>
+        <w:rPr>
+          <w:lang w:val="en-US"/>
+        </w:rPr>
+      </w:pPr>
+    </w:p>
+    <w:p>
+      <w:pPr>
+        <w:rPr>
+          <w:b/>
+          <w:bCs/>
+          <w:lang w:val="en-US"/>
+        </w:rPr>
+      </w:pPr>
+    </w:p>
+    <w:p>
+      <w:pPr>
+        <w:rPr>
+          <w:b/>
+          <w:bCs/>
+          <w:lang w:val="en-US"/>
+        </w:rPr>
+      </w:pPr>
+    </w:p>
+    <w:p>
+      <w:pPr>
+        <w:rPr>
+          <w:b/>
+          <w:bCs/>
+          <w:lang w:val="en-US"/>
+        </w:rPr>
+      </w:pPr>
+    </w:p>
+    <w:p>
+      <w:pPr>
+        <w:rPr>
+          <w:b/>
+          <w:bCs/>
+          <w:lang w:val="en-US"/>
+        </w:rPr>
+      </w:pPr>
+    </w:p>
+    <w:p>
+      <w:pPr>
+        <w:rPr>
+          <w:b/>
+          <w:bCs/>
+          <w:lang w:val="en-US"/>
+        </w:rPr>
+      </w:pPr>
+    </w:p>
+    <w:p>
+      <w:pPr>
+        <w:rPr>
+          <w:b/>
+          <w:bCs/>
+          <w:lang w:val="en-US"/>
+        </w:rPr>
+      </w:pPr>
+    </w:p>
+    <w:p>
+      <w:pPr>
+        <w:tabs>
+          <w:tab w:val="left" w:leader="dot" w:pos="17010"/>
+        </w:tabs>
+        <w:jc w:val="center"/>
+        <w:rPr>
+          <w:b/>
+          <w:bCs/>
+          <w:u w:val="single"/>
+          <w:lang w:val="en-US"/>
+        </w:rPr>
+      </w:pPr>
+      <w:r>
+        <w:rPr>
+          <w:b/>
+          <w:bCs/>
+          <w:u w:val="single"/>
+          <w:lang w:val="en-US"/>
+        </w:rPr>
+        <w:lastRenderedPageBreak/>
+        <w:t xml:space="preserve">Table of </w:t>
+      </w:r>
+      <w:r>
+        <w:rPr>
+          <w:b/>
+          <w:bCs/>
+          <w:u w:val="single"/>
+          <w:lang w:val="en-US"/>
+        </w:rPr>
+        <w:t>C</w:t>
+      </w:r>
+      <w:r>
+        <w:rPr>
+          <w:b/>
+          <w:bCs/>
+          <w:u w:val="single"/>
+          <w:lang w:val="en-US"/>
+        </w:rPr>
+        <w:t>ontents</w:t>
+      </w:r>
+    </w:p>
+    <w:p>
+      <w:pPr>
+        <w:pStyle w:val="ListParagraph"/>
+        <w:numPr>
+          <w:ilvl w:val="0"/>
+          <w:numId w:val="3"/>
+        </w:numPr>
+        <w:tabs>
+          <w:tab w:val="left" w:leader="dot" w:pos="8505"/>
+        </w:tabs>
+        <w:ind w:left="357" w:hanging="357"/>
+        <w:rPr>
           <w:b/>
           <w:bCs/>
           <w:lang w:val="en-US"/>
@@ -72,13 +303,6 @@
         </w:rPr>
         <w:t>Introduction</w:t>
       </w:r>
-    </w:p>
-    <w:p>
-      <w:pPr>
-        <w:rPr>
-          <w:lang w:val="en-US"/>
-        </w:rPr>
-      </w:pPr>
       <w:r>
         <w:rPr>
           <w:b/>
@@ -86,6 +310,572 @@
           <w:lang w:val="en-US"/>
         </w:rPr>
         <w:tab/>
+        <w:t>1</w:t>
+      </w:r>
+    </w:p>
+    <w:p>
+      <w:pPr>
+        <w:pStyle w:val="ListParagraph"/>
+        <w:numPr>
+          <w:ilvl w:val="0"/>
+          <w:numId w:val="3"/>
+        </w:numPr>
+        <w:tabs>
+          <w:tab w:val="left" w:leader="dot" w:pos="8505"/>
+        </w:tabs>
+        <w:rPr>
+          <w:b/>
+          <w:bCs/>
+          <w:lang w:val="en-US"/>
+        </w:rPr>
+      </w:pPr>
+      <w:r>
+        <w:rPr>
+          <w:b/>
+          <w:bCs/>
+          <w:lang w:val="en-US"/>
+        </w:rPr>
+        <w:t>Gameplay</w:t>
+      </w:r>
+      <w:r>
+        <w:rPr>
+          <w:b/>
+          <w:bCs/>
+          <w:lang w:val="en-US"/>
+        </w:rPr>
+        <w:tab/>
+        <w:t>2</w:t>
+      </w:r>
+    </w:p>
+    <w:p>
+      <w:pPr>
+        <w:pStyle w:val="ListParagraph"/>
+        <w:numPr>
+          <w:ilvl w:val="0"/>
+          <w:numId w:val="3"/>
+        </w:numPr>
+        <w:tabs>
+          <w:tab w:val="left" w:leader="dot" w:pos="8505"/>
+        </w:tabs>
+        <w:rPr>
+          <w:b/>
+          <w:bCs/>
+          <w:lang w:val="en-US"/>
+        </w:rPr>
+      </w:pPr>
+      <w:r>
+        <w:rPr>
+          <w:b/>
+          <w:bCs/>
+          <w:lang w:val="en-US"/>
+        </w:rPr>
+        <w:t>Story</w:t>
+      </w:r>
+      <w:r>
+        <w:rPr>
+          <w:b/>
+          <w:bCs/>
+          <w:lang w:val="en-US"/>
+        </w:rPr>
+        <w:tab/>
+        <w:t>3</w:t>
+      </w:r>
+    </w:p>
+    <w:p>
+      <w:pPr>
+        <w:pStyle w:val="ListParagraph"/>
+        <w:numPr>
+          <w:ilvl w:val="1"/>
+          <w:numId w:val="3"/>
+        </w:numPr>
+        <w:tabs>
+          <w:tab w:val="left" w:leader="dot" w:pos="8505"/>
+        </w:tabs>
+        <w:rPr>
+          <w:b/>
+          <w:bCs/>
+          <w:lang w:val="en-US"/>
+        </w:rPr>
+      </w:pPr>
+      <w:r>
+        <w:rPr>
+          <w:b/>
+          <w:bCs/>
+          <w:lang w:val="en-US"/>
+        </w:rPr>
+        <w:t>Plot</w:t>
+      </w:r>
+      <w:r>
+        <w:rPr>
+          <w:b/>
+          <w:bCs/>
+          <w:lang w:val="en-US"/>
+        </w:rPr>
+        <w:tab/>
+        <w:t>3</w:t>
+      </w:r>
+    </w:p>
+    <w:p>
+      <w:pPr>
+        <w:pStyle w:val="ListParagraph"/>
+        <w:numPr>
+          <w:ilvl w:val="1"/>
+          <w:numId w:val="3"/>
+        </w:numPr>
+        <w:tabs>
+          <w:tab w:val="left" w:leader="dot" w:pos="8505"/>
+        </w:tabs>
+        <w:rPr>
+          <w:b/>
+          <w:bCs/>
+          <w:lang w:val="en-US"/>
+        </w:rPr>
+      </w:pPr>
+      <w:r>
+        <w:rPr>
+          <w:b/>
+          <w:bCs/>
+          <w:lang w:val="en-US"/>
+        </w:rPr>
+        <w:t>Act 1</w:t>
+      </w:r>
+      <w:r>
+        <w:rPr>
+          <w:b/>
+          <w:bCs/>
+          <w:lang w:val="en-US"/>
+        </w:rPr>
+        <w:tab/>
+      </w:r>
+    </w:p>
+    <w:p>
+      <w:pPr>
+        <w:pStyle w:val="ListParagraph"/>
+        <w:numPr>
+          <w:ilvl w:val="1"/>
+          <w:numId w:val="3"/>
+        </w:numPr>
+        <w:tabs>
+          <w:tab w:val="left" w:leader="dot" w:pos="8505"/>
+        </w:tabs>
+        <w:rPr>
+          <w:b/>
+          <w:bCs/>
+          <w:lang w:val="en-US"/>
+        </w:rPr>
+      </w:pPr>
+      <w:r>
+        <w:rPr>
+          <w:b/>
+          <w:bCs/>
+          <w:lang w:val="en-US"/>
+        </w:rPr>
+        <w:t>Act 2</w:t>
+      </w:r>
+      <w:r>
+        <w:rPr>
+          <w:b/>
+          <w:bCs/>
+          <w:lang w:val="en-US"/>
+        </w:rPr>
+        <w:tab/>
+      </w:r>
+    </w:p>
+    <w:p>
+      <w:pPr>
+        <w:pStyle w:val="ListParagraph"/>
+        <w:numPr>
+          <w:ilvl w:val="1"/>
+          <w:numId w:val="3"/>
+        </w:numPr>
+        <w:tabs>
+          <w:tab w:val="left" w:leader="dot" w:pos="8505"/>
+        </w:tabs>
+        <w:rPr>
+          <w:b/>
+          <w:bCs/>
+          <w:lang w:val="en-US"/>
+        </w:rPr>
+      </w:pPr>
+      <w:r>
+        <w:rPr>
+          <w:b/>
+          <w:bCs/>
+          <w:lang w:val="en-US"/>
+        </w:rPr>
+        <w:t>Act 3</w:t>
+      </w:r>
+      <w:r>
+        <w:rPr>
+          <w:b/>
+          <w:bCs/>
+          <w:lang w:val="en-US"/>
+        </w:rPr>
+        <w:tab/>
+      </w:r>
+    </w:p>
+    <w:p>
+      <w:pPr>
+        <w:pStyle w:val="ListParagraph"/>
+        <w:numPr>
+          <w:ilvl w:val="1"/>
+          <w:numId w:val="3"/>
+        </w:numPr>
+        <w:tabs>
+          <w:tab w:val="left" w:leader="dot" w:pos="8505"/>
+        </w:tabs>
+        <w:rPr>
+          <w:b/>
+          <w:bCs/>
+          <w:lang w:val="en-US"/>
+        </w:rPr>
+      </w:pPr>
+      <w:r>
+        <w:rPr>
+          <w:b/>
+          <w:bCs/>
+          <w:lang w:val="en-US"/>
+        </w:rPr>
+        <w:t>Act 4</w:t>
+      </w:r>
+      <w:r>
+        <w:rPr>
+          <w:b/>
+          <w:bCs/>
+          <w:lang w:val="en-US"/>
+        </w:rPr>
+        <w:tab/>
+      </w:r>
+    </w:p>
+    <w:p>
+      <w:pPr>
+        <w:pStyle w:val="ListParagraph"/>
+        <w:tabs>
+          <w:tab w:val="left" w:leader="dot" w:pos="7938"/>
+          <w:tab w:val="left" w:leader="dot" w:pos="10206"/>
+          <w:tab w:val="left" w:leader="dot" w:pos="11340"/>
+          <w:tab w:val="left" w:leader="dot" w:pos="28350"/>
+        </w:tabs>
+        <w:rPr>
+          <w:b/>
+          <w:bCs/>
+          <w:lang w:val="en-US"/>
+        </w:rPr>
+      </w:pPr>
+    </w:p>
+    <w:p>
+      <w:pPr>
+        <w:pStyle w:val="ListParagraph"/>
+        <w:numPr>
+          <w:ilvl w:val="0"/>
+          <w:numId w:val="3"/>
+        </w:numPr>
+        <w:tabs>
+          <w:tab w:val="left" w:leader="dot" w:pos="10206"/>
+          <w:tab w:val="left" w:leader="dot" w:pos="11340"/>
+          <w:tab w:val="left" w:leader="dot" w:pos="28350"/>
+        </w:tabs>
+        <w:rPr>
+          <w:b/>
+          <w:bCs/>
+          <w:u w:val="single"/>
+          <w:lang w:val="en-US"/>
+        </w:rPr>
+      </w:pPr>
+    </w:p>
+    <w:p>
+      <w:pPr>
+        <w:tabs>
+          <w:tab w:val="right" w:leader="dot" w:pos="3402"/>
+          <w:tab w:val="left" w:leader="dot" w:pos="10206"/>
+          <w:tab w:val="left" w:leader="dot" w:pos="28350"/>
+        </w:tabs>
+        <w:rPr>
+          <w:b/>
+          <w:bCs/>
+          <w:u w:val="single"/>
+          <w:lang w:val="en-US"/>
+        </w:rPr>
+      </w:pPr>
+    </w:p>
+    <w:p>
+      <w:pPr>
+        <w:tabs>
+          <w:tab w:val="left" w:leader="dot" w:pos="10206"/>
+        </w:tabs>
+        <w:jc w:val="center"/>
+        <w:rPr>
+          <w:b/>
+          <w:bCs/>
+          <w:u w:val="single"/>
+          <w:lang w:val="en-US"/>
+        </w:rPr>
+      </w:pPr>
+    </w:p>
+    <w:p>
+      <w:pPr>
+        <w:jc w:val="center"/>
+        <w:rPr>
+          <w:b/>
+          <w:bCs/>
+          <w:u w:val="single"/>
+          <w:lang w:val="en-US"/>
+        </w:rPr>
+      </w:pPr>
+    </w:p>
+    <w:p>
+      <w:pPr>
+        <w:jc w:val="center"/>
+        <w:rPr>
+          <w:b/>
+          <w:bCs/>
+          <w:u w:val="single"/>
+          <w:lang w:val="en-US"/>
+        </w:rPr>
+      </w:pPr>
+    </w:p>
+    <w:p>
+      <w:pPr>
+        <w:jc w:val="center"/>
+        <w:rPr>
+          <w:b/>
+          <w:bCs/>
+          <w:u w:val="single"/>
+          <w:lang w:val="en-US"/>
+        </w:rPr>
+      </w:pPr>
+    </w:p>
+    <w:p>
+      <w:pPr>
+        <w:jc w:val="center"/>
+        <w:rPr>
+          <w:b/>
+          <w:bCs/>
+          <w:u w:val="single"/>
+          <w:lang w:val="en-US"/>
+        </w:rPr>
+      </w:pPr>
+    </w:p>
+    <w:p>
+      <w:pPr>
+        <w:jc w:val="center"/>
+        <w:rPr>
+          <w:b/>
+          <w:bCs/>
+          <w:u w:val="single"/>
+          <w:lang w:val="en-US"/>
+        </w:rPr>
+      </w:pPr>
+    </w:p>
+    <w:p>
+      <w:pPr>
+        <w:jc w:val="center"/>
+        <w:rPr>
+          <w:b/>
+          <w:bCs/>
+          <w:u w:val="single"/>
+          <w:lang w:val="en-US"/>
+        </w:rPr>
+      </w:pPr>
+    </w:p>
+    <w:p>
+      <w:pPr>
+        <w:jc w:val="center"/>
+        <w:rPr>
+          <w:b/>
+          <w:bCs/>
+          <w:u w:val="single"/>
+          <w:lang w:val="en-US"/>
+        </w:rPr>
+      </w:pPr>
+    </w:p>
+    <w:p>
+      <w:pPr>
+        <w:jc w:val="center"/>
+        <w:rPr>
+          <w:b/>
+          <w:bCs/>
+          <w:u w:val="single"/>
+          <w:lang w:val="en-US"/>
+        </w:rPr>
+      </w:pPr>
+    </w:p>
+    <w:p>
+      <w:pPr>
+        <w:jc w:val="center"/>
+        <w:rPr>
+          <w:b/>
+          <w:bCs/>
+          <w:u w:val="single"/>
+          <w:lang w:val="en-US"/>
+        </w:rPr>
+      </w:pPr>
+    </w:p>
+    <w:p>
+      <w:pPr>
+        <w:jc w:val="center"/>
+        <w:rPr>
+          <w:b/>
+          <w:bCs/>
+          <w:u w:val="single"/>
+          <w:lang w:val="en-US"/>
+        </w:rPr>
+      </w:pPr>
+    </w:p>
+    <w:p>
+      <w:pPr>
+        <w:jc w:val="center"/>
+        <w:rPr>
+          <w:b/>
+          <w:bCs/>
+          <w:u w:val="single"/>
+          <w:lang w:val="en-US"/>
+        </w:rPr>
+      </w:pPr>
+    </w:p>
+    <w:p>
+      <w:pPr>
+        <w:jc w:val="center"/>
+        <w:rPr>
+          <w:b/>
+          <w:bCs/>
+          <w:u w:val="single"/>
+          <w:lang w:val="en-US"/>
+        </w:rPr>
+      </w:pPr>
+    </w:p>
+    <w:p>
+      <w:pPr>
+        <w:jc w:val="center"/>
+        <w:rPr>
+          <w:b/>
+          <w:bCs/>
+          <w:u w:val="single"/>
+          <w:lang w:val="en-US"/>
+        </w:rPr>
+      </w:pPr>
+    </w:p>
+    <w:p>
+      <w:pPr>
+        <w:jc w:val="center"/>
+        <w:rPr>
+          <w:b/>
+          <w:bCs/>
+          <w:u w:val="single"/>
+          <w:lang w:val="en-US"/>
+        </w:rPr>
+      </w:pPr>
+    </w:p>
+    <w:p>
+      <w:pPr>
+        <w:jc w:val="center"/>
+        <w:rPr>
+          <w:b/>
+          <w:bCs/>
+          <w:u w:val="single"/>
+          <w:lang w:val="en-US"/>
+        </w:rPr>
+      </w:pPr>
+    </w:p>
+    <w:p>
+      <w:pPr>
+        <w:jc w:val="center"/>
+        <w:rPr>
+          <w:b/>
+          <w:bCs/>
+          <w:u w:val="single"/>
+          <w:lang w:val="en-US"/>
+        </w:rPr>
+      </w:pPr>
+    </w:p>
+    <w:p>
+      <w:pPr>
+        <w:jc w:val="center"/>
+        <w:rPr>
+          <w:b/>
+          <w:bCs/>
+          <w:u w:val="single"/>
+          <w:lang w:val="en-US"/>
+        </w:rPr>
+      </w:pPr>
+    </w:p>
+    <w:p>
+      <w:pPr>
+        <w:jc w:val="center"/>
+        <w:rPr>
+          <w:b/>
+          <w:bCs/>
+          <w:u w:val="single"/>
+          <w:lang w:val="en-US"/>
+        </w:rPr>
+      </w:pPr>
+    </w:p>
+    <w:p>
+      <w:pPr>
+        <w:jc w:val="center"/>
+        <w:rPr>
+          <w:b/>
+          <w:bCs/>
+          <w:u w:val="single"/>
+          <w:lang w:val="en-US"/>
+        </w:rPr>
+      </w:pPr>
+    </w:p>
+    <w:p>
+      <w:pPr>
+        <w:jc w:val="center"/>
+        <w:rPr>
+          <w:b/>
+          <w:bCs/>
+          <w:u w:val="single"/>
+          <w:lang w:val="en-US"/>
+        </w:rPr>
+      </w:pPr>
+    </w:p>
+    <w:p>
+      <w:pPr>
+        <w:jc w:val="center"/>
+        <w:rPr>
+          <w:b/>
+          <w:bCs/>
+          <w:u w:val="single"/>
+          <w:lang w:val="en-US"/>
+        </w:rPr>
+      </w:pPr>
+    </w:p>
+    <w:p>
+      <w:pPr>
+        <w:jc w:val="center"/>
+        <w:rPr>
+          <w:b/>
+          <w:bCs/>
+          <w:u w:val="single"/>
+          <w:lang w:val="en-US"/>
+        </w:rPr>
+      </w:pPr>
+      <w:r>
+        <w:rPr>
+          <w:b/>
+          <w:bCs/>
+          <w:u w:val="single"/>
+          <w:lang w:val="en-US"/>
+        </w:rPr>
+        <w:t>Plot</w:t>
+      </w:r>
+    </w:p>
+    <w:p>
+      <w:pPr>
+        <w:rPr>
+          <w:lang w:val="en-US"/>
+        </w:rPr>
+      </w:pPr>
+      <w:r>
+        <w:rPr>
+          <w:b/>
+          <w:bCs/>
+          <w:lang w:val="en-US"/>
+        </w:rPr>
+        <w:tab/>
       </w:r>
       <w:r>
         <w:rPr>
@@ -127,6 +917,114 @@
     </w:p>
     <w:p>
       <w:pPr>
+        <w:jc w:val="center"/>
+        <w:rPr>
+          <w:b/>
+          <w:bCs/>
+          <w:u w:val="single"/>
+          <w:lang w:val="en-US"/>
+        </w:rPr>
+      </w:pPr>
+      <w:r>
+        <w:rPr>
+          <w:b/>
+          <w:bCs/>
+          <w:u w:val="single"/>
+          <w:lang w:val="en-US"/>
+        </w:rPr>
+        <w:t>Gameplay</w:t>
+      </w:r>
+    </w:p>
+    <w:p>
+      <w:pPr>
+        <w:rPr>
+          <w:lang w:val="en-US"/>
+        </w:rPr>
+      </w:pPr>
+    </w:p>
+    <w:p>
+      <w:pPr>
+        <w:jc w:val="center"/>
+        <w:rPr>
+          <w:b/>
+          <w:bCs/>
+          <w:u w:val="single"/>
+          <w:lang w:val="en-US"/>
+        </w:rPr>
+      </w:pPr>
+      <w:r>
+        <w:rPr>
+          <w:b/>
+          <w:bCs/>
+          <w:u w:val="single"/>
+          <w:lang w:val="en-US"/>
+        </w:rPr>
+        <w:t>Story</w:t>
+      </w:r>
+    </w:p>
+    <w:p>
+      <w:pPr>
+        <w:jc w:val="center"/>
+        <w:rPr>
+          <w:b/>
+          <w:bCs/>
+          <w:u w:val="single"/>
+          <w:lang w:val="en-US"/>
+        </w:rPr>
+      </w:pPr>
+    </w:p>
+    <w:p>
+      <w:pPr>
+        <w:jc w:val="center"/>
+        <w:rPr>
+          <w:b/>
+          <w:bCs/>
+          <w:u w:val="single"/>
+          <w:lang w:val="en-US"/>
+        </w:rPr>
+      </w:pPr>
+      <w:r>
+        <w:rPr>
+          <w:b/>
+          <w:bCs/>
+          <w:u w:val="single"/>
+          <w:lang w:val="en-US"/>
+        </w:rPr>
+        <w:t>Plot</w:t>
+      </w:r>
+    </w:p>
+    <w:p>
+      <w:pPr>
+        <w:ind w:firstLine="720"/>
+      </w:pPr>
+      <w:r>
+        <w:rPr>
+          <w:lang w:val="en-US"/>
+        </w:rPr>
+        <w:t xml:space="preserve">The main character is either a </w:t>
+      </w:r>
+      <w:proofErr w:type="spellStart"/>
+      <w:r>
+        <w:t>Praefectus</w:t>
+      </w:r>
+      <w:proofErr w:type="spellEnd"/>
+      <w:r>
+        <w:t xml:space="preserve"> Urbi</w:t>
+      </w:r>
+      <w:r>
+        <w:t xml:space="preserve"> or their servant/slave. He will be charged with investigating what’s happening in the island. The slave can read so he works as a secretary for the </w:t>
+      </w:r>
+      <w:proofErr w:type="spellStart"/>
+      <w:r>
+        <w:t>Praefectus</w:t>
+      </w:r>
+      <w:proofErr w:type="spellEnd"/>
+      <w:r>
+        <w:t>. The motivation of the player as the Slave is to become a freeman. The slave is in love with the other Slave and is motivated to become free but is kept loyal because he wants to keep his relationship with the other slave.</w:t>
+      </w:r>
+    </w:p>
+    <w:p>
+      <w:pPr>
         <w:rPr>
           <w:b/>
           <w:bCs/>
@@ -153,24 +1051,12 @@
           <w:lang w:val="en-US"/>
         </w:rPr>
         <w:tab/>
-      </w:r>
-      <w:r>
-        <w:rPr>
-          <w:lang w:val="en-US"/>
-        </w:rPr>
         <w:t>The game starts with a conversation between Alexius and Primus. They must go to the city where each will do different things, implying that the game with be different depending on who you play as.  The player leaves his home and has two options: left or right. Left leads to a barricade where two soldiers block the road. One of them is Primus’ brother-in-law.</w:t>
       </w:r>
     </w:p>
     <w:p>
       <w:pPr>
         <w:rPr>
-          <w:lang w:val="en-US"/>
-        </w:rPr>
-      </w:pPr>
-    </w:p>
-    <w:p>
-      <w:pPr>
-        <w:rPr>
           <w:b/>
           <w:bCs/>
           <w:lang w:val="en-US"/>
@@ -267,6 +1153,205 @@
     </w:p>
     <w:p>
       <w:pPr>
+        <w:ind w:firstLine="720"/>
+      </w:pPr>
+    </w:p>
+    <w:p>
+      <w:pPr>
+        <w:rPr>
+          <w:b/>
+          <w:bCs/>
+        </w:rPr>
+      </w:pPr>
+      <w:r>
+        <w:rPr>
+          <w:b/>
+          <w:bCs/>
+        </w:rPr>
+        <w:t>Characters</w:t>
+      </w:r>
+    </w:p>
+    <w:p>
+      <w:pPr>
+        <w:rPr>
+          <w:lang w:val="fr-FR"/>
+        </w:rPr>
+      </w:pPr>
+      <w:proofErr w:type="spellStart"/>
+      <w:r>
+        <w:rPr>
+          <w:lang w:val="fr-FR"/>
+        </w:rPr>
+        <w:t>Alexius</w:t>
+      </w:r>
+      <w:proofErr w:type="spellEnd"/>
+      <w:r>
+        <w:rPr>
+          <w:lang w:val="fr-FR"/>
+        </w:rPr>
+        <w:t xml:space="preserve"> Philon - </w:t>
+      </w:r>
+      <w:proofErr w:type="spellStart"/>
+      <w:r>
+        <w:rPr>
+          <w:lang w:val="fr-FR"/>
+        </w:rPr>
+        <w:t>Praefectus</w:t>
+      </w:r>
+      <w:proofErr w:type="spellEnd"/>
+      <w:r>
+        <w:rPr>
+          <w:lang w:val="fr-FR"/>
+        </w:rPr>
+        <w:t xml:space="preserve"> Urbi. </w:t>
+      </w:r>
+      <w:proofErr w:type="spellStart"/>
+      <w:r>
+        <w:rPr>
+          <w:lang w:val="fr-FR"/>
+        </w:rPr>
+        <w:t>A</w:t>
+      </w:r>
+      <w:r>
+        <w:rPr>
+          <w:lang w:val="fr-FR"/>
+        </w:rPr>
+        <w:t>lexius</w:t>
+      </w:r>
+      <w:proofErr w:type="spellEnd"/>
+      <w:r>
+        <w:rPr>
+          <w:lang w:val="fr-FR"/>
+        </w:rPr>
+        <w:t xml:space="preserve"> </w:t>
+      </w:r>
+      <w:proofErr w:type="spellStart"/>
+      <w:r>
+        <w:rPr>
+          <w:lang w:val="fr-FR"/>
+        </w:rPr>
+        <w:t>is</w:t>
+      </w:r>
+      <w:proofErr w:type="spellEnd"/>
+      <w:r>
+        <w:rPr>
+          <w:lang w:val="fr-FR"/>
+        </w:rPr>
+        <w:t xml:space="preserve"> </w:t>
+      </w:r>
+    </w:p>
+    <w:p>
+      <w:r>
+        <w:t>Primus</w:t>
+      </w:r>
+      <w:r>
+        <w:t xml:space="preserve"> (</w:t>
+      </w:r>
+      <w:r>
+        <w:t>Petros Angelos</w:t>
+      </w:r>
+      <w:r>
+        <w:t>) -</w:t>
+      </w:r>
+      <w:r>
+        <w:t xml:space="preserve"> </w:t>
+      </w:r>
+      <w:r>
+        <w:t xml:space="preserve">Slave – </w:t>
+      </w:r>
+      <w:proofErr w:type="gramStart"/>
+      <w:r>
+        <w:t>( Primus</w:t>
+      </w:r>
+      <w:proofErr w:type="gramEnd"/>
+      <w:r>
+        <w:t xml:space="preserve"> is his slave nickname but he remembers his true name)</w:t>
+      </w:r>
+    </w:p>
+    <w:p>
+      <w:r>
+        <w:lastRenderedPageBreak/>
+        <w:tab/>
+        <w:t xml:space="preserve">Primus is from the </w:t>
+      </w:r>
+      <w:proofErr w:type="spellStart"/>
+      <w:r>
+        <w:t>Angeloi</w:t>
+      </w:r>
+      <w:proofErr w:type="spellEnd"/>
+      <w:r>
+        <w:t xml:space="preserve"> family. He was reduced to slavery after the conquest of the island. </w:t>
+      </w:r>
+    </w:p>
+    <w:p>
+      <w:r>
+        <w:t>Diana – Primus’ sister. She “avoided” slavery by marrying a roman soldier. She has some degree of freedom and is Primus’ biggest ally in the island. She loathes her husband but loves their son.</w:t>
+      </w:r>
+    </w:p>
+    <w:p>
+      <w:r>
+        <w:t xml:space="preserve">  </w:t>
+      </w:r>
+    </w:p>
+    <w:p/>
+    <w:p>
+      <w:pPr>
+        <w:rPr>
+          <w:b/>
+          <w:bCs/>
+        </w:rPr>
+      </w:pPr>
+      <w:r>
+        <w:rPr>
+          <w:b/>
+          <w:bCs/>
+        </w:rPr>
+        <w:t>Core Gameplay Mechanics</w:t>
+      </w:r>
+    </w:p>
+    <w:p>
+      <w:pPr>
+        <w:rPr>
+          <w:b/>
+          <w:bCs/>
+        </w:rPr>
+      </w:pPr>
+    </w:p>
+    <w:p>
+      <w:pPr>
+        <w:rPr>
+          <w:b/>
+          <w:bCs/>
+        </w:rPr>
+      </w:pPr>
+    </w:p>
+    <w:p>
+      <w:pPr>
+        <w:rPr>
+          <w:b/>
+          <w:bCs/>
+          <w:lang w:val="en-US"/>
+        </w:rPr>
+      </w:pPr>
+      <w:r>
+        <w:rPr>
+          <w:b/>
+          <w:bCs/>
+          <w:lang w:val="en-US"/>
+        </w:rPr>
+        <w:tab/>
+      </w:r>
+      <w:r>
+        <w:rPr>
+          <w:b/>
+          <w:bCs/>
+          <w:lang w:val="en-US"/>
+        </w:rPr>
+        <w:tab/>
+      </w:r>
+    </w:p>
+    <w:p>
+      <w:pPr>
         <w:rPr>
           <w:b/>
           <w:bCs/>
@@ -292,9 +1377,23 @@
     <w:p>
       <w:pPr>
         <w:rPr>
-          <w:lang w:val="en-US"/>
-        </w:rPr>
-      </w:pPr>
+          <w:b/>
+          <w:bCs/>
+        </w:rPr>
+      </w:pPr>
+    </w:p>
+    <w:p>
+      <w:pPr>
+        <w:rPr>
+          <w:lang w:val="en-US"/>
+        </w:rPr>
+      </w:pPr>
+      <w:r>
+        <w:rPr>
+          <w:lang w:val="en-US"/>
+        </w:rPr>
+        <w:t xml:space="preserve">Game Engine </w:t>
+      </w:r>
     </w:p>
     <w:p>
       <w:pPr>
@@ -307,9 +1406,9 @@
           <w:noProof/>
         </w:rPr>
         <w:drawing>
-          <wp:inline distT="0" distB="0" distL="0" distR="0" wp14:anchorId="0EBC3180" wp14:editId="3C43D794">
-            <wp:extent cx="2447223" cy="861060"/>
-            <wp:effectExtent l="0" t="0" r="0" b="0"/>
+          <wp:inline distT="0" distB="0" distL="0" distR="0" wp14:anchorId="0EBC3180" wp14:editId="0BC1E5BF">
+            <wp:extent cx="1891939" cy="665683"/>
+            <wp:effectExtent l="0" t="0" r="0" b="1270"/>
             <wp:docPr id="474068630" name="Picture 1" descr="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"/>
             <wp:cNvGraphicFramePr>
               <a:graphicFrameLocks xmlns:a="http://schemas.openxmlformats.org/drawingml/2006/main" noChangeAspect="1"/>
@@ -324,7 +1423,7 @@
                     </pic:cNvPicPr>
                   </pic:nvPicPr>
                   <pic:blipFill>
-                    <a:blip r:embed="rId5">
+                    <a:blip r:embed="rId7">
                       <a:extLst>
                         <a:ext uri="{28A0092B-C50C-407E-A947-70E740481C1C}">
                           <a14:useLocalDpi xmlns:a14="http://schemas.microsoft.com/office/drawing/2010/main" val="0"/>
@@ -339,7 +1438,7 @@
                   <pic:spPr bwMode="auto">
                     <a:xfrm>
                       <a:off x="0" y="0"/>
-                      <a:ext cx="2452073" cy="862767"/>
+                      <a:ext cx="1899484" cy="668338"/>
                     </a:xfrm>
                     <a:prstGeom prst="rect">
                       <a:avLst/>
@@ -407,7 +1506,7 @@
           <w:lang w:val="en-US"/>
         </w:rPr>
       </w:pPr>
-      <w:hyperlink r:id="rId6" w:history="1">
+      <w:hyperlink r:id="rId8" w:history="1">
         <w:r>
           <w:rPr>
             <w:rStyle w:val="Hyperlink"/>
@@ -452,7 +1551,7 @@
                     </pic:cNvPicPr>
                   </pic:nvPicPr>
                   <pic:blipFill>
-                    <a:blip r:embed="rId7">
+                    <a:blip r:embed="rId9">
                       <a:extLst>
                         <a:ext uri="{28A0092B-C50C-407E-A947-70E740481C1C}">
                           <a14:useLocalDpi xmlns:a14="http://schemas.microsoft.com/office/drawing/2010/main" val="0"/>
@@ -493,12 +1592,17 @@
     </w:p>
     <w:p>
       <w:pPr>
-        <w:rPr>
-          <w:lang w:val="en-US"/>
-        </w:rPr>
-      </w:pPr>
-      <w:r>
-        <w:rPr>
+        <w:jc w:val="center"/>
+        <w:rPr>
+          <w:b/>
+          <w:bCs/>
+          <w:lang w:val="en-US"/>
+        </w:rPr>
+      </w:pPr>
+      <w:r>
+        <w:rPr>
+          <w:b/>
+          <w:bCs/>
           <w:lang w:val="en-US"/>
         </w:rPr>
         <w:t>Audio</w:t>
@@ -517,24 +1621,31 @@
           <w:lang w:val="en-US"/>
         </w:rPr>
       </w:pPr>
-    </w:p>
-    <w:p>
-      <w:pPr>
-        <w:rPr>
-          <w:lang w:val="en-US"/>
-        </w:rPr>
-      </w:pPr>
-    </w:p>
-    <w:p>
-      <w:pPr>
-        <w:rPr>
-          <w:lang w:val="en-US"/>
-        </w:rPr>
-      </w:pPr>
-      <w:r>
-        <w:rPr>
-          <w:lang w:val="en-US"/>
-        </w:rPr>
+      <w:r>
+        <w:rPr>
+          <w:lang w:val="en-US"/>
+        </w:rPr>
+        <w:tab/>
+      </w:r>
+    </w:p>
+    <w:p>
+      <w:pPr>
+        <w:rPr>
+          <w:lang w:val="en-US"/>
+        </w:rPr>
+      </w:pPr>
+    </w:p>
+    <w:p>
+      <w:pPr>
+        <w:rPr>
+          <w:lang w:val="en-US"/>
+        </w:rPr>
+      </w:pPr>
+      <w:r>
+        <w:rPr>
+          <w:lang w:val="en-US"/>
+        </w:rPr>
+        <w:lastRenderedPageBreak/>
         <w:t>Music</w:t>
       </w:r>
     </w:p>
@@ -544,7 +1655,7 @@
           <w:lang w:val="en-US"/>
         </w:rPr>
       </w:pPr>
-      <w:hyperlink r:id="rId8" w:history="1">
+      <w:hyperlink r:id="rId10" w:history="1">
         <w:r>
           <w:rPr>
             <w:rStyle w:val="Hyperlink"/>
@@ -611,13 +1722,6 @@
           <w:lang w:val="en-US"/>
         </w:rPr>
       </w:pPr>
-    </w:p>
-    <w:p>
-      <w:pPr>
-        <w:rPr>
-          <w:lang w:val="en-US"/>
-        </w:rPr>
-      </w:pPr>
       <w:r>
         <w:rPr>
           <w:lang w:val="en-US"/>
@@ -674,259 +1778,6 @@
         </w:rPr>
         <w:t>Forgotten City</w:t>
       </w:r>
-    </w:p>
-    <w:p>
-      <w:pPr>
-        <w:rPr>
-          <w:b/>
-          <w:bCs/>
-          <w:lang w:val="en-US"/>
-        </w:rPr>
-      </w:pPr>
-      <w:r>
-        <w:rPr>
-          <w:b/>
-          <w:bCs/>
-          <w:lang w:val="en-US"/>
-        </w:rPr>
-        <w:t>Story</w:t>
-      </w:r>
-    </w:p>
-    <w:p>
-      <w:r>
-        <w:rPr>
-          <w:lang w:val="en-US"/>
-        </w:rPr>
-        <w:t xml:space="preserve">The main character is either a </w:t>
-      </w:r>
-      <w:proofErr w:type="spellStart"/>
-      <w:r>
-        <w:t>Praefectus</w:t>
-      </w:r>
-      <w:proofErr w:type="spellEnd"/>
-      <w:r>
-        <w:t xml:space="preserve"> Urbi</w:t>
-      </w:r>
-      <w:r>
-        <w:t xml:space="preserve"> or their servant/slave. He will be charged with investigating what’s happening in the island. </w:t>
-      </w:r>
-      <w:r>
-        <w:t>The</w:t>
-      </w:r>
-      <w:r>
-        <w:t xml:space="preserve"> slave can read so he works as a secretary for the </w:t>
-      </w:r>
-      <w:proofErr w:type="spellStart"/>
-      <w:r>
-        <w:t>Praefectus</w:t>
-      </w:r>
-      <w:proofErr w:type="spellEnd"/>
-      <w:r>
-        <w:t>. The motivation of the player as the Slave is to become a freeman. The slave is in love with the other Slave and is motivated to become free but is kept loyal because he wants to keep his relationship with the other slave.</w:t>
-      </w:r>
-    </w:p>
-    <w:p/>
-    <w:p>
-      <w:pPr>
-        <w:rPr>
-          <w:b/>
-          <w:bCs/>
-        </w:rPr>
-      </w:pPr>
-      <w:r>
-        <w:rPr>
-          <w:b/>
-          <w:bCs/>
-        </w:rPr>
-        <w:t>Characters</w:t>
-      </w:r>
-    </w:p>
-    <w:p>
-      <w:pPr>
-        <w:rPr>
-          <w:lang w:val="fr-FR"/>
-        </w:rPr>
-      </w:pPr>
-      <w:proofErr w:type="spellStart"/>
-      <w:r>
-        <w:rPr>
-          <w:lang w:val="fr-FR"/>
-        </w:rPr>
-        <w:t>Alexius</w:t>
-      </w:r>
-      <w:proofErr w:type="spellEnd"/>
-      <w:r>
-        <w:rPr>
-          <w:lang w:val="fr-FR"/>
-        </w:rPr>
-        <w:t xml:space="preserve"> Philon - </w:t>
-      </w:r>
-      <w:proofErr w:type="spellStart"/>
-      <w:r>
-        <w:rPr>
-          <w:lang w:val="fr-FR"/>
-        </w:rPr>
-        <w:t>Praefectus</w:t>
-      </w:r>
-      <w:proofErr w:type="spellEnd"/>
-      <w:r>
-        <w:rPr>
-          <w:lang w:val="fr-FR"/>
-        </w:rPr>
-        <w:t xml:space="preserve"> Urbi</w:t>
-      </w:r>
-      <w:r>
-        <w:rPr>
-          <w:lang w:val="fr-FR"/>
-        </w:rPr>
-        <w:t xml:space="preserve">. </w:t>
-      </w:r>
-      <w:proofErr w:type="spellStart"/>
-      <w:r>
-        <w:rPr>
-          <w:lang w:val="fr-FR"/>
-        </w:rPr>
-        <w:t>A</w:t>
-      </w:r>
-      <w:r>
-        <w:rPr>
-          <w:lang w:val="fr-FR"/>
-        </w:rPr>
-        <w:t>lexius</w:t>
-      </w:r>
-      <w:proofErr w:type="spellEnd"/>
-      <w:r>
-        <w:rPr>
-          <w:lang w:val="fr-FR"/>
-        </w:rPr>
-        <w:t xml:space="preserve"> </w:t>
-      </w:r>
-      <w:proofErr w:type="spellStart"/>
-      <w:r>
-        <w:rPr>
-          <w:lang w:val="fr-FR"/>
-        </w:rPr>
-        <w:t>is</w:t>
-      </w:r>
-      <w:proofErr w:type="spellEnd"/>
-      <w:r>
-        <w:rPr>
-          <w:lang w:val="fr-FR"/>
-        </w:rPr>
-        <w:t xml:space="preserve"> </w:t>
-      </w:r>
-    </w:p>
-    <w:p>
-      <w:r>
-        <w:t>Primus</w:t>
-      </w:r>
-      <w:r>
-        <w:t xml:space="preserve"> (</w:t>
-      </w:r>
-      <w:r>
-        <w:t>Petros Angelos</w:t>
-      </w:r>
-      <w:r>
-        <w:t>) -</w:t>
-      </w:r>
-      <w:r>
-        <w:t xml:space="preserve"> </w:t>
-      </w:r>
-      <w:r>
-        <w:t xml:space="preserve">Slave – </w:t>
-      </w:r>
-      <w:proofErr w:type="gramStart"/>
-      <w:r>
-        <w:t>(</w:t>
-      </w:r>
-      <w:r>
-        <w:t xml:space="preserve"> Primus</w:t>
-      </w:r>
-      <w:proofErr w:type="gramEnd"/>
-      <w:r>
-        <w:t xml:space="preserve"> is his </w:t>
-      </w:r>
-      <w:r>
-        <w:t>slave nickname</w:t>
-      </w:r>
-      <w:r>
-        <w:t xml:space="preserve"> but he remembers his true name</w:t>
-      </w:r>
-      <w:r>
-        <w:t>)</w:t>
-      </w:r>
-    </w:p>
-    <w:p>
-      <w:r>
-        <w:lastRenderedPageBreak/>
-        <w:tab/>
-        <w:t xml:space="preserve">Primus is from the </w:t>
-      </w:r>
-      <w:proofErr w:type="spellStart"/>
-      <w:r>
-        <w:t>Angeloi</w:t>
-      </w:r>
-      <w:proofErr w:type="spellEnd"/>
-      <w:r>
-        <w:t xml:space="preserve"> family. He was reduced to slavery </w:t>
-      </w:r>
-      <w:r>
-        <w:t>after</w:t>
-      </w:r>
-      <w:r>
-        <w:t xml:space="preserve"> the conquest of </w:t>
-      </w:r>
-      <w:r>
-        <w:t>the island</w:t>
-      </w:r>
-      <w:r>
-        <w:t xml:space="preserve">. </w:t>
-      </w:r>
-    </w:p>
-    <w:p>
-      <w:r>
-        <w:t>Diana</w:t>
-      </w:r>
-      <w:r>
-        <w:t xml:space="preserve"> – Primus’ sister. She “avoided” slavery by marrying a roman soldier. She has some degree of freedom and is Primus’ biggest ally in the island. She loathes her husband but loves their son.</w:t>
-      </w:r>
-    </w:p>
-    <w:p>
-      <w:r>
-        <w:t xml:space="preserve">  </w:t>
-      </w:r>
-    </w:p>
-    <w:p/>
-    <w:p>
-      <w:pPr>
-        <w:rPr>
-          <w:b/>
-          <w:bCs/>
-        </w:rPr>
-      </w:pPr>
-      <w:r>
-        <w:rPr>
-          <w:b/>
-          <w:bCs/>
-        </w:rPr>
-        <w:t>Core Gameplay Mechanics</w:t>
-      </w:r>
-    </w:p>
-    <w:p>
-      <w:pPr>
-        <w:rPr>
-          <w:b/>
-          <w:bCs/>
-        </w:rPr>
-      </w:pPr>
-    </w:p>
-    <w:p>
-      <w:pPr>
-        <w:rPr>
-          <w:b/>
-          <w:bCs/>
-        </w:rPr>
-      </w:pPr>
     </w:p>
     <w:p/>
     <w:p>
@@ -1078,6 +1929,56 @@
     </w:sectPr>
   </w:body>
 </w:document>
+</file>
+
+<file path=word/endnotes.xml><?xml version="1.0" encoding="utf-8"?>
+<w:endnotes xmlns:wpc="http://schemas.microsoft.com/office/word/2010/wordprocessingCanvas" xmlns:cx="http://schemas.microsoft.com/office/drawing/2014/chartex" xmlns:cx1="http://schemas.microsoft.com/office/drawing/2015/9/8/chartex" xmlns:cx2="http://schemas.microsoft.com/office/drawing/2015/10/21/chartex" xmlns:cx3="http://schemas.microsoft.com/office/drawing/2016/5/9/chartex" xmlns:cx4="http://schemas.microsoft.com/office/drawing/2016/5/10/chartex" xmlns:cx5="http://schemas.microsoft.com/office/drawing/2016/5/11/chartex" xmlns:cx6="http://schemas.microsoft.com/office/drawing/2016/5/12/chartex" xmlns:cx7="http://schemas.microsoft.com/office/drawing/2016/5/13/chartex" xmlns:cx8="http://schemas.microsoft.com/office/drawing/2016/5/14/chartex" xmlns:mc="http://schemas.openxmlformats.org/markup-compatibility/2006" xmlns:aink="http://schemas.microsoft.com/office/drawing/2016/ink" xmlns:am3d="http://schemas.microsoft.com/office/drawing/2017/model3d" xmlns:o="urn:schemas-microsoft-com:office:office" xmlns:oel="http://schemas.microsoft.com/office/2019/extlst" xmlns:r="http://schemas.openxmlformats.org/officeDocument/2006/relationships" xmlns:m="http://schemas.openxmlformats.org/officeDocument/2006/math" xmlns:v="urn:schemas-microsoft-com:vml" xmlns:wp14="http://schemas.microsoft.com/office/word/2010/wordprocessingDrawing" xmlns:wp="http://schemas.openxmlformats.org/drawingml/2006/wordprocessingDrawing" xmlns:w10="urn:schemas-microsoft-com:office:word" xmlns:w="http://schemas.openxmlformats.org/wordprocessingml/2006/main" xmlns:w14="http://schemas.microsoft.com/office/word/2010/wordml" xmlns:w15="http://schemas.microsoft.com/office/word/2012/wordml" xmlns:w16cex="http://schemas.microsoft.com/office/word/2018/wordml/cex" xmlns:w16cid="http://schemas.microsoft.com/office/word/2016/wordml/cid" xmlns:w16="http://schemas.microsoft.com/office/word/2018/wordml" xmlns:w16du="http://schemas.microsoft.com/office/word/2023/wordml/word16du" xmlns:w16sdtdh="http://schemas.microsoft.com/office/word/2020/wordml/sdtdatahash" xmlns:w16sdtfl="http://schemas.microsoft.com/office/word/2024/wordml/sdtformatlock" xmlns:w16se="http://schemas.microsoft.com/office/word/2015/wordml/symex" xmlns:wpg="http://schemas.microsoft.com/office/word/2010/wordprocessingGroup" xmlns:wpi="http://schemas.microsoft.com/office/word/2010/wordprocessingInk" xmlns:wne="http://schemas.microsoft.com/office/word/2006/wordml" xmlns:wps="http://schemas.microsoft.com/office/word/2010/wordprocessingShape" mc:Ignorable="w14 w15 w16se w16cid w16 w16cex w16sdtdh w16sdtfl w16du wp14">
+  <w:endnote w:type="separator" w:id="-1">
+    <w:p>
+      <w:pPr>
+        <w:spacing w:after="0" w:line="240" w:lineRule="auto"/>
+      </w:pPr>
+      <w:r>
+        <w:separator/>
+      </w:r>
+    </w:p>
+  </w:endnote>
+  <w:endnote w:type="continuationSeparator" w:id="0">
+    <w:p>
+      <w:pPr>
+        <w:spacing w:after="0" w:line="240" w:lineRule="auto"/>
+      </w:pPr>
+      <w:r>
+        <w:continuationSeparator/>
+      </w:r>
+    </w:p>
+  </w:endnote>
+</w:endnotes>
+</file>
+
+<file path=word/footnotes.xml><?xml version="1.0" encoding="utf-8"?>
+<w:footnotes xmlns:wpc="http://schemas.microsoft.com/office/word/2010/wordprocessingCanvas" xmlns:cx="http://schemas.microsoft.com/office/drawing/2014/chartex" xmlns:cx1="http://schemas.microsoft.com/office/drawing/2015/9/8/chartex" xmlns:cx2="http://schemas.microsoft.com/office/drawing/2015/10/21/chartex" xmlns:cx3="http://schemas.microsoft.com/office/drawing/2016/5/9/chartex" xmlns:cx4="http://schemas.microsoft.com/office/drawing/2016/5/10/chartex" xmlns:cx5="http://schemas.microsoft.com/office/drawing/2016/5/11/chartex" xmlns:cx6="http://schemas.microsoft.com/office/drawing/2016/5/12/chartex" xmlns:cx7="http://schemas.microsoft.com/office/drawing/2016/5/13/chartex" xmlns:cx8="http://schemas.microsoft.com/office/drawing/2016/5/14/chartex" xmlns:mc="http://schemas.openxmlformats.org/markup-compatibility/2006" xmlns:aink="http://schemas.microsoft.com/office/drawing/2016/ink" xmlns:am3d="http://schemas.microsoft.com/office/drawing/2017/model3d" xmlns:o="urn:schemas-microsoft-com:office:office" xmlns:oel="http://schemas.microsoft.com/office/2019/extlst" xmlns:r="http://schemas.openxmlformats.org/officeDocument/2006/relationships" xmlns:m="http://schemas.openxmlformats.org/officeDocument/2006/math" xmlns:v="urn:schemas-microsoft-com:vml" xmlns:wp14="http://schemas.microsoft.com/office/word/2010/wordprocessingDrawing" xmlns:wp="http://schemas.openxmlformats.org/drawingml/2006/wordprocessingDrawing" xmlns:w10="urn:schemas-microsoft-com:office:word" xmlns:w="http://schemas.openxmlformats.org/wordprocessingml/2006/main" xmlns:w14="http://schemas.microsoft.com/office/word/2010/wordml" xmlns:w15="http://schemas.microsoft.com/office/word/2012/wordml" xmlns:w16cex="http://schemas.microsoft.com/office/word/2018/wordml/cex" xmlns:w16cid="http://schemas.microsoft.com/office/word/2016/wordml/cid" xmlns:w16="http://schemas.microsoft.com/office/word/2018/wordml" xmlns:w16du="http://schemas.microsoft.com/office/word/2023/wordml/word16du" xmlns:w16sdtdh="http://schemas.microsoft.com/office/word/2020/wordml/sdtdatahash" xmlns:w16sdtfl="http://schemas.microsoft.com/office/word/2024/wordml/sdtformatlock" xmlns:w16se="http://schemas.microsoft.com/office/word/2015/wordml/symex" xmlns:wpg="http://schemas.microsoft.com/office/word/2010/wordprocessingGroup" xmlns:wpi="http://schemas.microsoft.com/office/word/2010/wordprocessingInk" xmlns:wne="http://schemas.microsoft.com/office/word/2006/wordml" xmlns:wps="http://schemas.microsoft.com/office/word/2010/wordprocessingShape" mc:Ignorable="w14 w15 w16se w16cid w16 w16cex w16sdtdh w16sdtfl w16du wp14">
+  <w:footnote w:type="separator" w:id="-1">
+    <w:p>
+      <w:pPr>
+        <w:spacing w:after="0" w:line="240" w:lineRule="auto"/>
+      </w:pPr>
+      <w:r>
+        <w:separator/>
+      </w:r>
+    </w:p>
+  </w:footnote>
+  <w:footnote w:type="continuationSeparator" w:id="0">
+    <w:p>
+      <w:pPr>
+        <w:spacing w:after="0" w:line="240" w:lineRule="auto"/>
+      </w:pPr>
+      <w:r>
+        <w:continuationSeparator/>
+      </w:r>
+    </w:p>
+  </w:footnote>
+</w:footnotes>
 </file>
 
 <file path=word/numbering.xml><?xml version="1.0" encoding="utf-8"?>
@@ -1195,6 +2096,95 @@
     </w:lvl>
   </w:abstractNum>
   <w:abstractNum w:abstractNumId="1" w15:restartNumberingAfterBreak="0">
+    <w:nsid w:val="44960020"/>
+    <w:multiLevelType w:val="multilevel"/>
+    <w:tmpl w:val="1009001F"/>
+    <w:lvl w:ilvl="0">
+      <w:start w:val="1"/>
+      <w:numFmt w:val="decimal"/>
+      <w:lvlText w:val="%1."/>
+      <w:lvlJc w:val="left"/>
+      <w:pPr>
+        <w:ind w:left="360" w:hanging="360"/>
+      </w:pPr>
+      <w:rPr>
+        <w:rFonts w:hint="default"/>
+      </w:rPr>
+    </w:lvl>
+    <w:lvl w:ilvl="1">
+      <w:start w:val="1"/>
+      <w:numFmt w:val="decimal"/>
+      <w:lvlText w:val="%1.%2."/>
+      <w:lvlJc w:val="left"/>
+      <w:pPr>
+        <w:ind w:left="792" w:hanging="432"/>
+      </w:pPr>
+    </w:lvl>
+    <w:lvl w:ilvl="2">
+      <w:start w:val="1"/>
+      <w:numFmt w:val="decimal"/>
+      <w:lvlText w:val="%1.%2.%3."/>
+      <w:lvlJc w:val="left"/>
+      <w:pPr>
+        <w:ind w:left="1224" w:hanging="504"/>
+      </w:pPr>
+    </w:lvl>
+    <w:lvl w:ilvl="3">
+      <w:start w:val="1"/>
+      <w:numFmt w:val="decimal"/>
+      <w:lvlText w:val="%1.%2.%3.%4."/>
+      <w:lvlJc w:val="left"/>
+      <w:pPr>
+        <w:ind w:left="1728" w:hanging="648"/>
+      </w:pPr>
+    </w:lvl>
+    <w:lvl w:ilvl="4">
+      <w:start w:val="1"/>
+      <w:numFmt w:val="decimal"/>
+      <w:lvlText w:val="%1.%2.%3.%4.%5."/>
+      <w:lvlJc w:val="left"/>
+      <w:pPr>
+        <w:ind w:left="2232" w:hanging="792"/>
+      </w:pPr>
+    </w:lvl>
+    <w:lvl w:ilvl="5">
+      <w:start w:val="1"/>
+      <w:numFmt w:val="decimal"/>
+      <w:lvlText w:val="%1.%2.%3.%4.%5.%6."/>
+      <w:lvlJc w:val="left"/>
+      <w:pPr>
+        <w:ind w:left="2736" w:hanging="936"/>
+      </w:pPr>
+    </w:lvl>
+    <w:lvl w:ilvl="6">
+      <w:start w:val="1"/>
+      <w:numFmt w:val="decimal"/>
+      <w:lvlText w:val="%1.%2.%3.%4.%5.%6.%7."/>
+      <w:lvlJc w:val="left"/>
+      <w:pPr>
+        <w:ind w:left="3240" w:hanging="1080"/>
+      </w:pPr>
+    </w:lvl>
+    <w:lvl w:ilvl="7">
+      <w:start w:val="1"/>
+      <w:numFmt w:val="decimal"/>
+      <w:lvlText w:val="%1.%2.%3.%4.%5.%6.%7.%8."/>
+      <w:lvlJc w:val="left"/>
+      <w:pPr>
+        <w:ind w:left="3744" w:hanging="1224"/>
+      </w:pPr>
+    </w:lvl>
+    <w:lvl w:ilvl="8">
+      <w:start w:val="1"/>
+      <w:numFmt w:val="decimal"/>
+      <w:lvlText w:val="%1.%2.%3.%4.%5.%6.%7.%8.%9."/>
+      <w:lvlJc w:val="left"/>
+      <w:pPr>
+        <w:ind w:left="4320" w:hanging="1440"/>
+      </w:pPr>
+    </w:lvl>
+  </w:abstractNum>
+  <w:abstractNum w:abstractNumId="2" w15:restartNumberingAfterBreak="0">
     <w:nsid w:val="4573137E"/>
     <w:multiLevelType w:val="hybridMultilevel"/>
     <w:tmpl w:val="C33C4EEC"/>
@@ -1310,6 +2300,9 @@
     <w:abstractNumId w:val="0"/>
   </w:num>
   <w:num w:numId="2" w16cid:durableId="201982790">
+    <w:abstractNumId w:val="2"/>
+  </w:num>
+  <w:num w:numId="3" w16cid:durableId="477381008">
     <w:abstractNumId w:val="1"/>
   </w:num>
 </w:numbering>
@@ -2255,6 +3248,69 @@
       <w:shd w:val="clear" w:color="auto" w:fill="E1DFDD"/>
     </w:rPr>
   </w:style>
+  <w:style w:type="paragraph" w:styleId="Header">
+    <w:name w:val="header"/>
+    <w:basedOn w:val="Normal"/>
+    <w:link w:val="HeaderChar"/>
+    <w:uiPriority w:val="99"/>
+    <w:unhideWhenUsed/>
+    <w:rsid w:val="00EF0169"/>
+    <w:pPr>
+      <w:tabs>
+        <w:tab w:val="center" w:pos="4680"/>
+        <w:tab w:val="right" w:pos="9360"/>
+      </w:tabs>
+      <w:spacing w:after="0" w:line="240" w:lineRule="auto"/>
+    </w:pPr>
+  </w:style>
+  <w:style w:type="character" w:customStyle="1" w:styleId="HeaderChar">
+    <w:name w:val="Header Char"/>
+    <w:basedOn w:val="DefaultParagraphFont"/>
+    <w:link w:val="Header"/>
+    <w:uiPriority w:val="99"/>
+    <w:rsid w:val="00EF0169"/>
+  </w:style>
+  <w:style w:type="paragraph" w:styleId="Footer">
+    <w:name w:val="footer"/>
+    <w:basedOn w:val="Normal"/>
+    <w:link w:val="FooterChar"/>
+    <w:uiPriority w:val="99"/>
+    <w:unhideWhenUsed/>
+    <w:rsid w:val="00EF0169"/>
+    <w:pPr>
+      <w:tabs>
+        <w:tab w:val="center" w:pos="4680"/>
+        <w:tab w:val="right" w:pos="9360"/>
+      </w:tabs>
+      <w:spacing w:after="0" w:line="240" w:lineRule="auto"/>
+    </w:pPr>
+  </w:style>
+  <w:style w:type="character" w:customStyle="1" w:styleId="FooterChar">
+    <w:name w:val="Footer Char"/>
+    <w:basedOn w:val="DefaultParagraphFont"/>
+    <w:link w:val="Footer"/>
+    <w:uiPriority w:val="99"/>
+    <w:rsid w:val="00EF0169"/>
+  </w:style>
+  <w:style w:type="table" w:styleId="TableGrid">
+    <w:name w:val="Table Grid"/>
+    <w:basedOn w:val="TableNormal"/>
+    <w:uiPriority w:val="39"/>
+    <w:rsid w:val="00A366FC"/>
+    <w:pPr>
+      <w:spacing w:after="0" w:line="240" w:lineRule="auto"/>
+    </w:pPr>
+    <w:tblPr>
+      <w:tblBorders>
+        <w:top w:val="single" w:sz="4" w:space="0" w:color="auto"/>
+        <w:left w:val="single" w:sz="4" w:space="0" w:color="auto"/>
+        <w:bottom w:val="single" w:sz="4" w:space="0" w:color="auto"/>
+        <w:right w:val="single" w:sz="4" w:space="0" w:color="auto"/>
+        <w:insideH w:val="single" w:sz="4" w:space="0" w:color="auto"/>
+        <w:insideV w:val="single" w:sz="4" w:space="0" w:color="auto"/>
+      </w:tblBorders>
+    </w:tblPr>
+  </w:style>
 </w:styles>
 </file>
 

</xml_diff>

<commit_message>
added several characters and to plot
</commit_message>
<xml_diff>
--- a/Content/Docs/GDD_Murder_In_Purple.docx
+++ b/Content/Docs/GDD_Murder_In_Purple.docx
@@ -941,6 +941,19 @@
           <w:lang w:val="en-US"/>
         </w:rPr>
       </w:pPr>
+      <w:r>
+        <w:rPr>
+          <w:lang w:val="en-US"/>
+        </w:rPr>
+        <w:t>Core Mechanic</w:t>
+      </w:r>
+    </w:p>
+    <w:p>
+      <w:pPr>
+        <w:rPr>
+          <w:lang w:val="en-US"/>
+        </w:rPr>
+      </w:pPr>
     </w:p>
     <w:p>
       <w:pPr>
@@ -1003,24 +1016,46 @@
         </w:rPr>
         <w:t xml:space="preserve">The main character is either a </w:t>
       </w:r>
-      <w:proofErr w:type="spellStart"/>
-      <w:r>
-        <w:t>Praefectus</w:t>
-      </w:r>
-      <w:proofErr w:type="spellEnd"/>
-      <w:r>
-        <w:t xml:space="preserve"> Urbi</w:t>
-      </w:r>
-      <w:r>
-        <w:t xml:space="preserve"> or their servant/slave. He will be charged with investigating what’s happening in the island. The slave can read so he works as a secretary for the </w:t>
-      </w:r>
-      <w:proofErr w:type="spellStart"/>
-      <w:r>
-        <w:t>Praefectus</w:t>
-      </w:r>
-      <w:proofErr w:type="spellEnd"/>
-      <w:r>
-        <w:t>. The motivation of the player as the Slave is to become a freeman. The slave is in love with the other Slave and is motivated to become free but is kept loyal because he wants to keep his relationship with the other slave.</w:t>
+      <w:r>
+        <w:t>Praefectus Urbi</w:t>
+      </w:r>
+      <w:r>
+        <w:t xml:space="preserve"> Alexius </w:t>
+      </w:r>
+      <w:r>
+        <w:t>Philon</w:t>
+      </w:r>
+      <w:r>
+        <w:t xml:space="preserve"> </w:t>
+      </w:r>
+      <w:r>
+        <w:t>or their servant/</w:t>
+      </w:r>
+      <w:r>
+        <w:t>slave’s name Primus</w:t>
+      </w:r>
+      <w:r>
+        <w:t>. He will be charged with investigating what’s happening in the island. The slave can read so he works as a secretary for the Praefectus. The motivation of the player as the Slave is to become a freeman. The slave is in love with the other Slave and is motivated to become free but is kept loyal because he wants to keep his relationship with the other slave.</w:t>
+      </w:r>
+    </w:p>
+    <w:p>
+      <w:pPr>
+        <w:ind w:firstLine="720"/>
+      </w:pPr>
+      <w:r>
+        <w:t xml:space="preserve">The island where they live is very agitated, </w:t>
+      </w:r>
+      <w:r>
+        <w:t xml:space="preserve">as it will host the meeting of the two rulers of the roman empire. The senior emperor Lucian Varro ( Lucian the Gaul ) is meeting his nephew Varro </w:t>
+      </w:r>
+      <w:r>
+        <w:t xml:space="preserve">as an island in the Aegean it was chosen for its proximity to many urban </w:t>
+      </w:r>
+      <w:r>
+        <w:t>centers</w:t>
+      </w:r>
+      <w:r>
+        <w:t xml:space="preserve"> and the meeting will be protected by the </w:t>
       </w:r>
     </w:p>
     <w:p>
@@ -1057,6 +1092,26 @@
     <w:p>
       <w:pPr>
         <w:rPr>
+          <w:lang w:val="en-US"/>
+        </w:rPr>
+      </w:pPr>
+    </w:p>
+    <w:p>
+      <w:pPr>
+        <w:rPr>
+          <w:lang w:val="en-US"/>
+        </w:rPr>
+      </w:pPr>
+      <w:r>
+        <w:rPr>
+          <w:lang w:val="en-US"/>
+        </w:rPr>
+        <w:t xml:space="preserve">The first act will be a murder, or so you think. Well, a person was murdered but that wasn’t what happened. The gates will be locked because </w:t>
+      </w:r>
+    </w:p>
+    <w:p>
+      <w:pPr>
+        <w:rPr>
           <w:b/>
           <w:bCs/>
           <w:lang w:val="en-US"/>
@@ -1161,216 +1216,261 @@
         <w:rPr>
           <w:b/>
           <w:bCs/>
-        </w:rPr>
-      </w:pPr>
-      <w:r>
-        <w:rPr>
-          <w:b/>
-          <w:bCs/>
+          <w:lang w:val="fr-FR"/>
+        </w:rPr>
+      </w:pPr>
+    </w:p>
+    <w:p>
+      <w:pPr>
+        <w:rPr>
+          <w:b/>
+          <w:bCs/>
+          <w:lang w:val="fr-FR"/>
+        </w:rPr>
+      </w:pPr>
+    </w:p>
+    <w:p>
+      <w:pPr>
+        <w:rPr>
+          <w:b/>
+          <w:bCs/>
+          <w:lang w:val="fr-FR"/>
+        </w:rPr>
+      </w:pPr>
+    </w:p>
+    <w:p>
+      <w:pPr>
+        <w:rPr>
+          <w:b/>
+          <w:bCs/>
+          <w:lang w:val="fr-FR"/>
+        </w:rPr>
+      </w:pPr>
+      <w:r>
+        <w:rPr>
+          <w:b/>
+          <w:bCs/>
+          <w:lang w:val="fr-FR"/>
         </w:rPr>
         <w:t>Characters</w:t>
       </w:r>
-    </w:p>
-    <w:p>
-      <w:pPr>
-        <w:rPr>
+      <w:r>
+        <w:rPr>
+          <w:b/>
+          <w:bCs/>
           <w:lang w:val="fr-FR"/>
         </w:rPr>
-      </w:pPr>
-      <w:proofErr w:type="spellStart"/>
-      <w:r>
-        <w:rPr>
+        <w:t xml:space="preserve"> (20 </w:t>
+      </w:r>
+      <w:r>
+        <w:rPr>
+          <w:b/>
+          <w:bCs/>
           <w:lang w:val="fr-FR"/>
         </w:rPr>
-        <w:t>Alexius</w:t>
-      </w:r>
-      <w:proofErr w:type="spellEnd"/>
+        <w:t>characters)</w:t>
+      </w:r>
+    </w:p>
+    <w:p>
       <w:r>
         <w:rPr>
           <w:lang w:val="fr-FR"/>
         </w:rPr>
-        <w:t xml:space="preserve"> Philon - </w:t>
-      </w:r>
-      <w:proofErr w:type="spellStart"/>
-      <w:r>
-        <w:rPr>
-          <w:lang w:val="fr-FR"/>
-        </w:rPr>
-        <w:t>Praefectus</w:t>
-      </w:r>
-      <w:proofErr w:type="spellEnd"/>
-      <w:r>
-        <w:rPr>
-          <w:lang w:val="fr-FR"/>
-        </w:rPr>
-        <w:t xml:space="preserve"> Urbi. </w:t>
-      </w:r>
-      <w:proofErr w:type="spellStart"/>
-      <w:r>
-        <w:rPr>
-          <w:lang w:val="fr-FR"/>
-        </w:rPr>
-        <w:t>A</w:t>
-      </w:r>
-      <w:r>
-        <w:rPr>
-          <w:lang w:val="fr-FR"/>
-        </w:rPr>
-        <w:t>lexius</w:t>
-      </w:r>
-      <w:proofErr w:type="spellEnd"/>
-      <w:r>
-        <w:rPr>
-          <w:lang w:val="fr-FR"/>
-        </w:rPr>
+        <w:t xml:space="preserve">Alexius Philon - Praefectus Urbi. </w:t>
+      </w:r>
+      <w:r>
+        <w:t xml:space="preserve">Alexius is </w:t>
+      </w:r>
+    </w:p>
+    <w:p>
+      <w:r>
+        <w:t>Primus</w:t>
+      </w:r>
+      <w:r>
+        <w:t xml:space="preserve"> (</w:t>
+      </w:r>
+      <w:r>
+        <w:t>Petros Angelos</w:t>
+      </w:r>
+      <w:r>
+        <w:t>) -</w:t>
+      </w:r>
+      <w:r>
         <w:t xml:space="preserve"> </w:t>
       </w:r>
-      <w:proofErr w:type="spellStart"/>
-      <w:r>
-        <w:rPr>
-          <w:lang w:val="fr-FR"/>
-        </w:rPr>
-        <w:t>is</w:t>
-      </w:r>
-      <w:proofErr w:type="spellEnd"/>
-      <w:r>
-        <w:rPr>
-          <w:lang w:val="fr-FR"/>
-        </w:rPr>
+      <w:r>
+        <w:t>Slave – ( Primus is his slave nickname but he remembers his true name)</w:t>
+      </w:r>
+    </w:p>
+    <w:p>
+      <w:r>
+        <w:tab/>
+        <w:t>Primus is from the Angeloi family. He was reduced to slavery after the conquest of the</w:t>
+      </w:r>
+      <w:r>
         <w:t xml:space="preserve"> </w:t>
       </w:r>
-    </w:p>
-    <w:p>
-      <w:r>
-        <w:t>Primus</w:t>
-      </w:r>
-      <w:r>
-        <w:t xml:space="preserve"> (</w:t>
-      </w:r>
-      <w:r>
-        <w:t>Petros Angelos</w:t>
-      </w:r>
-      <w:r>
-        <w:t>) -</w:t>
+      <w:r>
+        <w:t xml:space="preserve">island. </w:t>
+      </w:r>
+    </w:p>
+    <w:p>
+      <w:r>
+        <w:t>Diana – Primus’ sister. She “avoided” slavery by marrying a roman soldier. She has some degree of freedom and is Primus’ biggest ally in the island. She loathes her husband but loves their son.</w:t>
+      </w:r>
+    </w:p>
+    <w:p>
+      <w:r>
+        <w:t>Soldier 1 - Married to Diana and an apparent antagonist in the beginning of the game but will turn out to be an ally to both characters</w:t>
+      </w:r>
+    </w:p>
+    <w:p>
+      <w:r>
+        <w:t>Soldier 2 -</w:t>
       </w:r>
       <w:r>
         <w:t xml:space="preserve"> </w:t>
       </w:r>
       <w:r>
-        <w:t xml:space="preserve">Slave – </w:t>
-      </w:r>
-      <w:proofErr w:type="gramStart"/>
-      <w:r>
-        <w:t>( Primus</w:t>
-      </w:r>
-      <w:proofErr w:type="gramEnd"/>
-      <w:r>
-        <w:t xml:space="preserve"> is his slave nickname but he remembers his true name)</w:t>
-      </w:r>
-    </w:p>
-    <w:p>
-      <w:r>
+        <w:t xml:space="preserve">  </w:t>
+      </w:r>
+    </w:p>
+    <w:p>
+      <w:r>
+        <w:t>Gatekeeper (at the gate</w:t>
+      </w:r>
+      <w:r>
+        <w:t>e</w:t>
+      </w:r>
+      <w:r>
+        <w:t xml:space="preserve">) – Not very relevant. He’ll be great to get news from and will play some mechanical </w:t>
+      </w:r>
+      <w:r>
+        <w:t>purpose.</w:t>
+      </w:r>
+    </w:p>
+    <w:p>
+      <w:r>
+        <w:t>Legate</w:t>
+      </w:r>
+      <w:r>
+        <w:t xml:space="preserve"> – He’ll show up during the first act but wont be interacted with in the second act. He should be mentioned a few times during the second act and in the act one to add a sense of stability and </w:t>
+      </w:r>
+      <w:r>
+        <w:t xml:space="preserve">will </w:t>
+      </w:r>
+      <w:r>
+        <w:t>die in the second act, even though he won’t be the main investigation for the second act.</w:t>
+      </w:r>
+    </w:p>
+    <w:p>
+      <w:r>
+        <w:t xml:space="preserve">Emperor 1 - </w:t>
+      </w:r>
+      <w:r>
+        <w:t>Lucian the Gaul</w:t>
+      </w:r>
+      <w:r>
+        <w:t xml:space="preserve"> – He do</w:t>
+      </w:r>
+      <w:r>
+        <w:t xml:space="preserve">esn’t like to be called the Gaul but everyone knows his that way. His royal name is Lucian Varro and he was adopted by the last emperor </w:t>
+      </w:r>
+      <w:r>
+        <w:t>Marcus</w:t>
+      </w:r>
+      <w:r>
+        <w:t xml:space="preserve"> Varro</w:t>
+      </w:r>
+      <w:r>
+        <w:t xml:space="preserve"> He  is a son of the legions. Fought in every role for the roman army and was acclaimed by his legions Imperator. </w:t>
+      </w:r>
+    </w:p>
+    <w:p>
+      <w:r>
+        <w:t>Emperor 2 -</w:t>
+      </w:r>
+      <w:r>
+        <w:t xml:space="preserve">  </w:t>
+      </w:r>
+      <w:r>
+        <w:t xml:space="preserve"> </w:t>
+      </w:r>
+      <w:r>
+        <w:t>Nephew of the current emperor. He became junior augustii when his father died. He has recently defeated all rebellion in the west.</w:t>
+      </w:r>
+    </w:p>
+    <w:p>
+      <w:r>
+        <w:t>Last Emperor – Marcus Varro – He w</w:t>
+      </w:r>
+      <w:r>
+        <w:t>on’t show up on the story and will have been dead for two years.</w:t>
+      </w:r>
+    </w:p>
+    <w:p>
+      <w:r>
+        <w:t>Praefectus Classis</w:t>
+      </w:r>
+      <w:r>
+        <w:t xml:space="preserve"> – Closest to an admiral in ancient Rome. </w:t>
+      </w:r>
+    </w:p>
+    <w:p>
+      <w:pPr>
+        <w:rPr>
+          <w:b/>
+          <w:bCs/>
+        </w:rPr>
+      </w:pPr>
+    </w:p>
+    <w:p>
+      <w:pPr>
+        <w:rPr>
+          <w:b/>
+          <w:bCs/>
+          <w:lang w:val="en-US"/>
+        </w:rPr>
+      </w:pPr>
+      <w:r>
+        <w:rPr>
+          <w:b/>
+          <w:bCs/>
+          <w:lang w:val="en-US"/>
+        </w:rPr>
+        <w:tab/>
+      </w:r>
+      <w:r>
+        <w:rPr>
+          <w:b/>
+          <w:bCs/>
+          <w:lang w:val="en-US"/>
+        </w:rPr>
+        <w:tab/>
+      </w:r>
+    </w:p>
+    <w:p>
+      <w:pPr>
+        <w:rPr>
+          <w:b/>
+          <w:bCs/>
+          <w:lang w:val="en-US"/>
+        </w:rPr>
+      </w:pPr>
+    </w:p>
+    <w:p>
+      <w:pPr>
+        <w:rPr>
+          <w:b/>
+          <w:bCs/>
+        </w:rPr>
+      </w:pPr>
+      <w:r>
+        <w:rPr>
+          <w:b/>
+          <w:bCs/>
+        </w:rPr>
         <w:lastRenderedPageBreak/>
-        <w:tab/>
-        <w:t xml:space="preserve">Primus is from the </w:t>
-      </w:r>
-      <w:proofErr w:type="spellStart"/>
-      <w:r>
-        <w:t>Angeloi</w:t>
-      </w:r>
-      <w:proofErr w:type="spellEnd"/>
-      <w:r>
-        <w:t xml:space="preserve"> family. He was reduced to slavery after the conquest of the island. </w:t>
-      </w:r>
-    </w:p>
-    <w:p>
-      <w:r>
-        <w:t>Diana – Primus’ sister. She “avoided” slavery by marrying a roman soldier. She has some degree of freedom and is Primus’ biggest ally in the island. She loathes her husband but loves their son.</w:t>
-      </w:r>
-    </w:p>
-    <w:p>
-      <w:r>
-        <w:t xml:space="preserve">  </w:t>
-      </w:r>
-    </w:p>
-    <w:p/>
-    <w:p>
-      <w:pPr>
-        <w:rPr>
-          <w:b/>
-          <w:bCs/>
-        </w:rPr>
-      </w:pPr>
-      <w:r>
-        <w:rPr>
-          <w:b/>
-          <w:bCs/>
-        </w:rPr>
-        <w:t>Core Gameplay Mechanics</w:t>
-      </w:r>
-    </w:p>
-    <w:p>
-      <w:pPr>
-        <w:rPr>
-          <w:b/>
-          <w:bCs/>
-        </w:rPr>
-      </w:pPr>
-    </w:p>
-    <w:p>
-      <w:pPr>
-        <w:rPr>
-          <w:b/>
-          <w:bCs/>
-        </w:rPr>
-      </w:pPr>
-    </w:p>
-    <w:p>
-      <w:pPr>
-        <w:rPr>
-          <w:b/>
-          <w:bCs/>
-          <w:lang w:val="en-US"/>
-        </w:rPr>
-      </w:pPr>
-      <w:r>
-        <w:rPr>
-          <w:b/>
-          <w:bCs/>
-          <w:lang w:val="en-US"/>
-        </w:rPr>
-        <w:tab/>
-      </w:r>
-      <w:r>
-        <w:rPr>
-          <w:b/>
-          <w:bCs/>
-          <w:lang w:val="en-US"/>
-        </w:rPr>
-        <w:tab/>
-      </w:r>
-    </w:p>
-    <w:p>
-      <w:pPr>
-        <w:rPr>
-          <w:b/>
-          <w:bCs/>
-          <w:lang w:val="en-US"/>
-        </w:rPr>
-      </w:pPr>
-    </w:p>
-    <w:p>
-      <w:pPr>
-        <w:rPr>
-          <w:b/>
-          <w:bCs/>
-        </w:rPr>
-      </w:pPr>
-      <w:r>
-        <w:rPr>
-          <w:b/>
-          <w:bCs/>
-        </w:rPr>
         <w:t>Basic Technical Info</w:t>
       </w:r>
     </w:p>
@@ -1645,7 +1745,6 @@
         <w:rPr>
           <w:lang w:val="en-US"/>
         </w:rPr>
-        <w:lastRenderedPageBreak/>
         <w:t>Music</w:t>
       </w:r>
     </w:p>
@@ -1699,21 +1798,7 @@
         <w:rPr>
           <w:lang w:val="en-US"/>
         </w:rPr>
-        <w:t xml:space="preserve">Sherlock Holmes: Crimes and Punishment </w:t>
-      </w:r>
-      <w:proofErr w:type="gramStart"/>
-      <w:r>
-        <w:rPr>
-          <w:lang w:val="en-US"/>
-        </w:rPr>
-        <w:t>–  UI</w:t>
-      </w:r>
-      <w:proofErr w:type="gramEnd"/>
-      <w:r>
-        <w:rPr>
-          <w:lang w:val="en-US"/>
-        </w:rPr>
-        <w:t xml:space="preserve"> for investigation, except for weird word addition</w:t>
+        <w:t>Sherlock Holmes: Crimes and Punishment –  UI for investigation, except for weird word addition</w:t>
       </w:r>
     </w:p>
     <w:p>
@@ -1811,6 +1896,7 @@
     </w:p>
     <w:p>
       <w:r>
+        <w:lastRenderedPageBreak/>
         <w:t>Character Selection</w:t>
       </w:r>
     </w:p>
@@ -1822,11 +1908,9 @@
           <w:numId w:val="1"/>
         </w:numPr>
       </w:pPr>
-      <w:proofErr w:type="spellStart"/>
       <w:r>
         <w:t>Praefectus</w:t>
       </w:r>
-      <w:proofErr w:type="spellEnd"/>
     </w:p>
     <w:p>
       <w:pPr>
@@ -1899,6 +1983,78 @@
           <w:lang w:val="en-US"/>
         </w:rPr>
         <w:t>Aqueducts</w:t>
+      </w:r>
+    </w:p>
+    <w:p>
+      <w:pPr>
+        <w:pStyle w:val="ListParagraph"/>
+        <w:numPr>
+          <w:ilvl w:val="0"/>
+          <w:numId w:val="1"/>
+        </w:numPr>
+        <w:rPr>
+          <w:lang w:val="en-US"/>
+        </w:rPr>
+      </w:pPr>
+      <w:r>
+        <w:rPr>
+          <w:lang w:val="en-US"/>
+        </w:rPr>
+        <w:t>Statues</w:t>
+      </w:r>
+    </w:p>
+    <w:p>
+      <w:pPr>
+        <w:pStyle w:val="ListParagraph"/>
+        <w:numPr>
+          <w:ilvl w:val="0"/>
+          <w:numId w:val="1"/>
+        </w:numPr>
+        <w:rPr>
+          <w:lang w:val="en-US"/>
+        </w:rPr>
+      </w:pPr>
+      <w:r>
+        <w:rPr>
+          <w:lang w:val="en-US"/>
+        </w:rPr>
+        <w:t>Emperors</w:t>
+      </w:r>
+    </w:p>
+    <w:p>
+      <w:pPr>
+        <w:pStyle w:val="ListParagraph"/>
+        <w:numPr>
+          <w:ilvl w:val="0"/>
+          <w:numId w:val="1"/>
+        </w:numPr>
+        <w:rPr>
+          <w:lang w:val="en-US"/>
+        </w:rPr>
+      </w:pPr>
+      <w:r>
+        <w:rPr>
+          <w:lang w:val="en-US"/>
+        </w:rPr>
+        <w:t>Ships</w:t>
+      </w:r>
+    </w:p>
+    <w:p>
+      <w:pPr>
+        <w:pStyle w:val="ListParagraph"/>
+        <w:numPr>
+          <w:ilvl w:val="0"/>
+          <w:numId w:val="1"/>
+        </w:numPr>
+        <w:rPr>
+          <w:lang w:val="en-US"/>
+        </w:rPr>
+      </w:pPr>
+      <w:r>
+        <w:rPr>
+          <w:lang w:val="en-US"/>
+        </w:rPr>
+        <w:t>Legion</w:t>
       </w:r>
     </w:p>
     <w:p>
@@ -2911,7 +3067,6 @@
   <w:style w:type="character" w:default="1" w:styleId="DefaultParagraphFont">
     <w:name w:val="Default Paragraph Font"/>
     <w:uiPriority w:val="1"/>
-    <w:semiHidden/>
     <w:unhideWhenUsed/>
   </w:style>
   <w:style w:type="table" w:default="1" w:styleId="TableNormal">

</xml_diff>